<commit_message>
PC -> lap: Aprendizaje
</commit_message>
<xml_diff>
--- a/TAREAS 6 SEMESTRE/Programación Paralela y en Tiempo Real/QuijasContreras_Medidas de Rendimiento_Act6.docx
+++ b/TAREAS 6 SEMESTRE/Programación Paralela y en Tiempo Real/QuijasContreras_Medidas de Rendimiento_Act6.docx
@@ -1197,15 +1197,7 @@
                                 <w:sz w:val="40"/>
                                 <w:szCs w:val="44"/>
                               </w:rPr>
-                              <w:t>0</w:t>
-                            </w:r>
-                            <w:r>
-                              <w:rPr>
-                                <w:rFonts w:asciiTheme="majorHAnsi" w:hAnsiTheme="majorHAnsi" w:cstheme="majorHAnsi"/>
-                                <w:sz w:val="40"/>
-                                <w:szCs w:val="44"/>
-                              </w:rPr>
-                              <w:t>9</w:t>
+                              <w:t>12</w:t>
                             </w:r>
                             <w:r>
                               <w:rPr>
@@ -1423,15 +1415,7 @@
                           <w:sz w:val="40"/>
                           <w:szCs w:val="44"/>
                         </w:rPr>
-                        <w:t>0</w:t>
-                      </w:r>
-                      <w:r>
-                        <w:rPr>
-                          <w:rFonts w:asciiTheme="majorHAnsi" w:hAnsiTheme="majorHAnsi" w:cstheme="majorHAnsi"/>
-                          <w:sz w:val="40"/>
-                          <w:szCs w:val="44"/>
-                        </w:rPr>
-                        <w:t>9</w:t>
+                        <w:t>12</w:t>
                       </w:r>
                       <w:r>
                         <w:rPr>
@@ -1484,7 +1468,7 @@
         <w:br w:type="page"/>
       </w:r>
     </w:p>
-    <w:bookmarkStart w:id="0" w:name="_Toc220850609" w:displacedByCustomXml="next"/>
+    <w:bookmarkStart w:id="0" w:name="_Toc240139299" w:displacedByCustomXml="next"/>
     <w:sdt>
       <w:sdtPr>
         <w:rPr>
@@ -1551,7 +1535,7 @@
           <w:r>
             <w:fldChar w:fldCharType="separate"/>
           </w:r>
-          <w:hyperlink w:anchor="_Toc220850609" w:history="1">
+          <w:hyperlink w:anchor="_Toc240139299" w:history="1">
             <w:r>
               <w:rPr>
                 <w:rStyle w:val="Hipervnculo"/>
@@ -1579,7 +1563,7 @@
                 <w:noProof/>
                 <w:webHidden/>
               </w:rPr>
-              <w:instrText xml:space="preserve"> PAGEREF _Toc220850609 \h </w:instrText>
+              <w:instrText xml:space="preserve"> PAGEREF _Toc240139299 \h </w:instrText>
             </w:r>
             <w:r>
               <w:rPr>
@@ -1622,13 +1606,13 @@
               <w:color w:val="auto"/>
             </w:rPr>
           </w:pPr>
-          <w:hyperlink w:anchor="_Toc220850610" w:history="1">
+          <w:hyperlink w:anchor="_Toc240139300" w:history="1">
             <w:r>
               <w:rPr>
                 <w:rStyle w:val="Hipervnculo"/>
                 <w:noProof/>
               </w:rPr>
-              <w:t>Tabla de ilustraciones</w:t>
+              <w:t>Benchmarks</w:t>
             </w:r>
             <w:r>
               <w:rPr>
@@ -1649,7 +1633,7 @@
                 <w:noProof/>
                 <w:webHidden/>
               </w:rPr>
-              <w:instrText xml:space="preserve"> PAGEREF _Toc220850610 \h </w:instrText>
+              <w:instrText xml:space="preserve"> PAGEREF _Toc240139300 \h </w:instrText>
             </w:r>
             <w:r>
               <w:rPr>
@@ -1670,6 +1654,1126 @@
                 <w:webHidden/>
               </w:rPr>
               <w:t>1</w:t>
+            </w:r>
+            <w:r>
+              <w:rPr>
+                <w:noProof/>
+                <w:webHidden/>
+              </w:rPr>
+              <w:fldChar w:fldCharType="end"/>
+            </w:r>
+          </w:hyperlink>
+        </w:p>
+        <w:p>
+          <w:pPr>
+            <w:pStyle w:val="TDC2"/>
+            <w:tabs>
+              <w:tab w:val="right" w:leader="dot" w:pos="9111"/>
+            </w:tabs>
+            <w:rPr>
+              <w:rFonts w:asciiTheme="minorHAnsi" w:eastAsiaTheme="minorEastAsia" w:hAnsiTheme="minorHAnsi" w:cstheme="minorBidi"/>
+              <w:noProof/>
+              <w:color w:val="auto"/>
+            </w:rPr>
+          </w:pPr>
+          <w:hyperlink w:anchor="_Toc240139301" w:history="1">
+            <w:r>
+              <w:rPr>
+                <w:rStyle w:val="Hipervnculo"/>
+                <w:noProof/>
+              </w:rPr>
+              <w:t>CPU</w:t>
+            </w:r>
+            <w:r>
+              <w:rPr>
+                <w:noProof/>
+                <w:webHidden/>
+              </w:rPr>
+              <w:tab/>
+            </w:r>
+            <w:r>
+              <w:rPr>
+                <w:noProof/>
+                <w:webHidden/>
+              </w:rPr>
+              <w:fldChar w:fldCharType="begin"/>
+            </w:r>
+            <w:r>
+              <w:rPr>
+                <w:noProof/>
+                <w:webHidden/>
+              </w:rPr>
+              <w:instrText xml:space="preserve"> PAGEREF _Toc240139301 \h </w:instrText>
+            </w:r>
+            <w:r>
+              <w:rPr>
+                <w:noProof/>
+                <w:webHidden/>
+              </w:rPr>
+            </w:r>
+            <w:r>
+              <w:rPr>
+                <w:noProof/>
+                <w:webHidden/>
+              </w:rPr>
+              <w:fldChar w:fldCharType="separate"/>
+            </w:r>
+            <w:r>
+              <w:rPr>
+                <w:noProof/>
+                <w:webHidden/>
+              </w:rPr>
+              <w:t>1</w:t>
+            </w:r>
+            <w:r>
+              <w:rPr>
+                <w:noProof/>
+                <w:webHidden/>
+              </w:rPr>
+              <w:fldChar w:fldCharType="end"/>
+            </w:r>
+          </w:hyperlink>
+        </w:p>
+        <w:p>
+          <w:pPr>
+            <w:pStyle w:val="TDC3"/>
+            <w:tabs>
+              <w:tab w:val="right" w:leader="dot" w:pos="9111"/>
+            </w:tabs>
+            <w:rPr>
+              <w:rFonts w:asciiTheme="minorHAnsi" w:eastAsiaTheme="minorEastAsia" w:hAnsiTheme="minorHAnsi" w:cstheme="minorBidi"/>
+              <w:noProof/>
+              <w:color w:val="auto"/>
+            </w:rPr>
+          </w:pPr>
+          <w:hyperlink w:anchor="_Toc240139302" w:history="1">
+            <w:r>
+              <w:rPr>
+                <w:rStyle w:val="Hipervnculo"/>
+                <w:noProof/>
+              </w:rPr>
+              <w:t>Cinebench</w:t>
+            </w:r>
+            <w:r>
+              <w:rPr>
+                <w:noProof/>
+                <w:webHidden/>
+              </w:rPr>
+              <w:tab/>
+            </w:r>
+            <w:r>
+              <w:rPr>
+                <w:noProof/>
+                <w:webHidden/>
+              </w:rPr>
+              <w:fldChar w:fldCharType="begin"/>
+            </w:r>
+            <w:r>
+              <w:rPr>
+                <w:noProof/>
+                <w:webHidden/>
+              </w:rPr>
+              <w:instrText xml:space="preserve"> PAGEREF _Toc240139302 \h </w:instrText>
+            </w:r>
+            <w:r>
+              <w:rPr>
+                <w:noProof/>
+                <w:webHidden/>
+              </w:rPr>
+            </w:r>
+            <w:r>
+              <w:rPr>
+                <w:noProof/>
+                <w:webHidden/>
+              </w:rPr>
+              <w:fldChar w:fldCharType="separate"/>
+            </w:r>
+            <w:r>
+              <w:rPr>
+                <w:noProof/>
+                <w:webHidden/>
+              </w:rPr>
+              <w:t>1</w:t>
+            </w:r>
+            <w:r>
+              <w:rPr>
+                <w:noProof/>
+                <w:webHidden/>
+              </w:rPr>
+              <w:fldChar w:fldCharType="end"/>
+            </w:r>
+          </w:hyperlink>
+        </w:p>
+        <w:p>
+          <w:pPr>
+            <w:pStyle w:val="TDC3"/>
+            <w:tabs>
+              <w:tab w:val="right" w:leader="dot" w:pos="9111"/>
+            </w:tabs>
+            <w:rPr>
+              <w:rFonts w:asciiTheme="minorHAnsi" w:eastAsiaTheme="minorEastAsia" w:hAnsiTheme="minorHAnsi" w:cstheme="minorBidi"/>
+              <w:noProof/>
+              <w:color w:val="auto"/>
+            </w:rPr>
+          </w:pPr>
+          <w:hyperlink w:anchor="_Toc240139303" w:history="1">
+            <w:r>
+              <w:rPr>
+                <w:rStyle w:val="Hipervnculo"/>
+                <w:noProof/>
+              </w:rPr>
+              <w:t>Geekbench 7</w:t>
+            </w:r>
+            <w:r>
+              <w:rPr>
+                <w:noProof/>
+                <w:webHidden/>
+              </w:rPr>
+              <w:tab/>
+            </w:r>
+            <w:r>
+              <w:rPr>
+                <w:noProof/>
+                <w:webHidden/>
+              </w:rPr>
+              <w:fldChar w:fldCharType="begin"/>
+            </w:r>
+            <w:r>
+              <w:rPr>
+                <w:noProof/>
+                <w:webHidden/>
+              </w:rPr>
+              <w:instrText xml:space="preserve"> PAGEREF _Toc240139303 \h </w:instrText>
+            </w:r>
+            <w:r>
+              <w:rPr>
+                <w:noProof/>
+                <w:webHidden/>
+              </w:rPr>
+            </w:r>
+            <w:r>
+              <w:rPr>
+                <w:noProof/>
+                <w:webHidden/>
+              </w:rPr>
+              <w:fldChar w:fldCharType="separate"/>
+            </w:r>
+            <w:r>
+              <w:rPr>
+                <w:noProof/>
+                <w:webHidden/>
+              </w:rPr>
+              <w:t>1</w:t>
+            </w:r>
+            <w:r>
+              <w:rPr>
+                <w:noProof/>
+                <w:webHidden/>
+              </w:rPr>
+              <w:fldChar w:fldCharType="end"/>
+            </w:r>
+          </w:hyperlink>
+        </w:p>
+        <w:p>
+          <w:pPr>
+            <w:pStyle w:val="TDC3"/>
+            <w:tabs>
+              <w:tab w:val="right" w:leader="dot" w:pos="9111"/>
+            </w:tabs>
+            <w:rPr>
+              <w:rFonts w:asciiTheme="minorHAnsi" w:eastAsiaTheme="minorEastAsia" w:hAnsiTheme="minorHAnsi" w:cstheme="minorBidi"/>
+              <w:noProof/>
+              <w:color w:val="auto"/>
+            </w:rPr>
+          </w:pPr>
+          <w:hyperlink w:anchor="_Toc240139304" w:history="1">
+            <w:r>
+              <w:rPr>
+                <w:rStyle w:val="Hipervnculo"/>
+                <w:noProof/>
+              </w:rPr>
+              <w:t>CPU-Z</w:t>
+            </w:r>
+            <w:r>
+              <w:rPr>
+                <w:noProof/>
+                <w:webHidden/>
+              </w:rPr>
+              <w:tab/>
+            </w:r>
+            <w:r>
+              <w:rPr>
+                <w:noProof/>
+                <w:webHidden/>
+              </w:rPr>
+              <w:fldChar w:fldCharType="begin"/>
+            </w:r>
+            <w:r>
+              <w:rPr>
+                <w:noProof/>
+                <w:webHidden/>
+              </w:rPr>
+              <w:instrText xml:space="preserve"> PAGEREF _Toc240139304 \h </w:instrText>
+            </w:r>
+            <w:r>
+              <w:rPr>
+                <w:noProof/>
+                <w:webHidden/>
+              </w:rPr>
+            </w:r>
+            <w:r>
+              <w:rPr>
+                <w:noProof/>
+                <w:webHidden/>
+              </w:rPr>
+              <w:fldChar w:fldCharType="separate"/>
+            </w:r>
+            <w:r>
+              <w:rPr>
+                <w:noProof/>
+                <w:webHidden/>
+              </w:rPr>
+              <w:t>2</w:t>
+            </w:r>
+            <w:r>
+              <w:rPr>
+                <w:noProof/>
+                <w:webHidden/>
+              </w:rPr>
+              <w:fldChar w:fldCharType="end"/>
+            </w:r>
+          </w:hyperlink>
+        </w:p>
+        <w:p>
+          <w:pPr>
+            <w:pStyle w:val="TDC2"/>
+            <w:tabs>
+              <w:tab w:val="right" w:leader="dot" w:pos="9111"/>
+            </w:tabs>
+            <w:rPr>
+              <w:rFonts w:asciiTheme="minorHAnsi" w:eastAsiaTheme="minorEastAsia" w:hAnsiTheme="minorHAnsi" w:cstheme="minorBidi"/>
+              <w:noProof/>
+              <w:color w:val="auto"/>
+            </w:rPr>
+          </w:pPr>
+          <w:hyperlink w:anchor="_Toc240139305" w:history="1">
+            <w:r>
+              <w:rPr>
+                <w:rStyle w:val="Hipervnculo"/>
+                <w:noProof/>
+              </w:rPr>
+              <w:t>RAM</w:t>
+            </w:r>
+            <w:r>
+              <w:rPr>
+                <w:noProof/>
+                <w:webHidden/>
+              </w:rPr>
+              <w:tab/>
+            </w:r>
+            <w:r>
+              <w:rPr>
+                <w:noProof/>
+                <w:webHidden/>
+              </w:rPr>
+              <w:fldChar w:fldCharType="begin"/>
+            </w:r>
+            <w:r>
+              <w:rPr>
+                <w:noProof/>
+                <w:webHidden/>
+              </w:rPr>
+              <w:instrText xml:space="preserve"> PAGEREF _Toc240139305 \h </w:instrText>
+            </w:r>
+            <w:r>
+              <w:rPr>
+                <w:noProof/>
+                <w:webHidden/>
+              </w:rPr>
+            </w:r>
+            <w:r>
+              <w:rPr>
+                <w:noProof/>
+                <w:webHidden/>
+              </w:rPr>
+              <w:fldChar w:fldCharType="separate"/>
+            </w:r>
+            <w:r>
+              <w:rPr>
+                <w:noProof/>
+                <w:webHidden/>
+              </w:rPr>
+              <w:t>2</w:t>
+            </w:r>
+            <w:r>
+              <w:rPr>
+                <w:noProof/>
+                <w:webHidden/>
+              </w:rPr>
+              <w:fldChar w:fldCharType="end"/>
+            </w:r>
+          </w:hyperlink>
+        </w:p>
+        <w:p>
+          <w:pPr>
+            <w:pStyle w:val="TDC3"/>
+            <w:tabs>
+              <w:tab w:val="right" w:leader="dot" w:pos="9111"/>
+            </w:tabs>
+            <w:rPr>
+              <w:rFonts w:asciiTheme="minorHAnsi" w:eastAsiaTheme="minorEastAsia" w:hAnsiTheme="minorHAnsi" w:cstheme="minorBidi"/>
+              <w:noProof/>
+              <w:color w:val="auto"/>
+            </w:rPr>
+          </w:pPr>
+          <w:hyperlink w:anchor="_Toc240139306" w:history="1">
+            <w:r>
+              <w:rPr>
+                <w:rStyle w:val="Hipervnculo"/>
+                <w:noProof/>
+              </w:rPr>
+              <w:t>AIDA64</w:t>
+            </w:r>
+            <w:r>
+              <w:rPr>
+                <w:noProof/>
+                <w:webHidden/>
+              </w:rPr>
+              <w:tab/>
+            </w:r>
+            <w:r>
+              <w:rPr>
+                <w:noProof/>
+                <w:webHidden/>
+              </w:rPr>
+              <w:fldChar w:fldCharType="begin"/>
+            </w:r>
+            <w:r>
+              <w:rPr>
+                <w:noProof/>
+                <w:webHidden/>
+              </w:rPr>
+              <w:instrText xml:space="preserve"> PAGEREF _Toc240139306 \h </w:instrText>
+            </w:r>
+            <w:r>
+              <w:rPr>
+                <w:noProof/>
+                <w:webHidden/>
+              </w:rPr>
+            </w:r>
+            <w:r>
+              <w:rPr>
+                <w:noProof/>
+                <w:webHidden/>
+              </w:rPr>
+              <w:fldChar w:fldCharType="separate"/>
+            </w:r>
+            <w:r>
+              <w:rPr>
+                <w:noProof/>
+                <w:webHidden/>
+              </w:rPr>
+              <w:t>2</w:t>
+            </w:r>
+            <w:r>
+              <w:rPr>
+                <w:noProof/>
+                <w:webHidden/>
+              </w:rPr>
+              <w:fldChar w:fldCharType="end"/>
+            </w:r>
+          </w:hyperlink>
+        </w:p>
+        <w:p>
+          <w:pPr>
+            <w:pStyle w:val="TDC3"/>
+            <w:tabs>
+              <w:tab w:val="right" w:leader="dot" w:pos="9111"/>
+            </w:tabs>
+            <w:rPr>
+              <w:rFonts w:asciiTheme="minorHAnsi" w:eastAsiaTheme="minorEastAsia" w:hAnsiTheme="minorHAnsi" w:cstheme="minorBidi"/>
+              <w:noProof/>
+              <w:color w:val="auto"/>
+            </w:rPr>
+          </w:pPr>
+          <w:hyperlink w:anchor="_Toc240139307" w:history="1">
+            <w:r>
+              <w:rPr>
+                <w:rStyle w:val="Hipervnculo"/>
+                <w:noProof/>
+              </w:rPr>
+              <w:t>MaxxMEM²</w:t>
+            </w:r>
+            <w:r>
+              <w:rPr>
+                <w:noProof/>
+                <w:webHidden/>
+              </w:rPr>
+              <w:tab/>
+            </w:r>
+            <w:r>
+              <w:rPr>
+                <w:noProof/>
+                <w:webHidden/>
+              </w:rPr>
+              <w:fldChar w:fldCharType="begin"/>
+            </w:r>
+            <w:r>
+              <w:rPr>
+                <w:noProof/>
+                <w:webHidden/>
+              </w:rPr>
+              <w:instrText xml:space="preserve"> PAGEREF _Toc240139307 \h </w:instrText>
+            </w:r>
+            <w:r>
+              <w:rPr>
+                <w:noProof/>
+                <w:webHidden/>
+              </w:rPr>
+            </w:r>
+            <w:r>
+              <w:rPr>
+                <w:noProof/>
+                <w:webHidden/>
+              </w:rPr>
+              <w:fldChar w:fldCharType="separate"/>
+            </w:r>
+            <w:r>
+              <w:rPr>
+                <w:noProof/>
+                <w:webHidden/>
+              </w:rPr>
+              <w:t>2</w:t>
+            </w:r>
+            <w:r>
+              <w:rPr>
+                <w:noProof/>
+                <w:webHidden/>
+              </w:rPr>
+              <w:fldChar w:fldCharType="end"/>
+            </w:r>
+          </w:hyperlink>
+        </w:p>
+        <w:p>
+          <w:pPr>
+            <w:pStyle w:val="TDC2"/>
+            <w:tabs>
+              <w:tab w:val="right" w:leader="dot" w:pos="9111"/>
+            </w:tabs>
+            <w:rPr>
+              <w:rFonts w:asciiTheme="minorHAnsi" w:eastAsiaTheme="minorEastAsia" w:hAnsiTheme="minorHAnsi" w:cstheme="minorBidi"/>
+              <w:noProof/>
+              <w:color w:val="auto"/>
+            </w:rPr>
+          </w:pPr>
+          <w:hyperlink w:anchor="_Toc240139308" w:history="1">
+            <w:r>
+              <w:rPr>
+                <w:rStyle w:val="Hipervnculo"/>
+                <w:noProof/>
+              </w:rPr>
+              <w:t>Unidades de almacenamiento</w:t>
+            </w:r>
+            <w:r>
+              <w:rPr>
+                <w:noProof/>
+                <w:webHidden/>
+              </w:rPr>
+              <w:tab/>
+            </w:r>
+            <w:r>
+              <w:rPr>
+                <w:noProof/>
+                <w:webHidden/>
+              </w:rPr>
+              <w:fldChar w:fldCharType="begin"/>
+            </w:r>
+            <w:r>
+              <w:rPr>
+                <w:noProof/>
+                <w:webHidden/>
+              </w:rPr>
+              <w:instrText xml:space="preserve"> PAGEREF _Toc240139308 \h </w:instrText>
+            </w:r>
+            <w:r>
+              <w:rPr>
+                <w:noProof/>
+                <w:webHidden/>
+              </w:rPr>
+            </w:r>
+            <w:r>
+              <w:rPr>
+                <w:noProof/>
+                <w:webHidden/>
+              </w:rPr>
+              <w:fldChar w:fldCharType="separate"/>
+            </w:r>
+            <w:r>
+              <w:rPr>
+                <w:noProof/>
+                <w:webHidden/>
+              </w:rPr>
+              <w:t>2</w:t>
+            </w:r>
+            <w:r>
+              <w:rPr>
+                <w:noProof/>
+                <w:webHidden/>
+              </w:rPr>
+              <w:fldChar w:fldCharType="end"/>
+            </w:r>
+          </w:hyperlink>
+        </w:p>
+        <w:p>
+          <w:pPr>
+            <w:pStyle w:val="TDC3"/>
+            <w:tabs>
+              <w:tab w:val="right" w:leader="dot" w:pos="9111"/>
+            </w:tabs>
+            <w:rPr>
+              <w:rFonts w:asciiTheme="minorHAnsi" w:eastAsiaTheme="minorEastAsia" w:hAnsiTheme="minorHAnsi" w:cstheme="minorBidi"/>
+              <w:noProof/>
+              <w:color w:val="auto"/>
+            </w:rPr>
+          </w:pPr>
+          <w:hyperlink w:anchor="_Toc240139309" w:history="1">
+            <w:r>
+              <w:rPr>
+                <w:rStyle w:val="Hipervnculo"/>
+                <w:noProof/>
+              </w:rPr>
+              <w:t>CrystalDiskMark</w:t>
+            </w:r>
+            <w:r>
+              <w:rPr>
+                <w:noProof/>
+                <w:webHidden/>
+              </w:rPr>
+              <w:tab/>
+            </w:r>
+            <w:r>
+              <w:rPr>
+                <w:noProof/>
+                <w:webHidden/>
+              </w:rPr>
+              <w:fldChar w:fldCharType="begin"/>
+            </w:r>
+            <w:r>
+              <w:rPr>
+                <w:noProof/>
+                <w:webHidden/>
+              </w:rPr>
+              <w:instrText xml:space="preserve"> PAGEREF _Toc240139309 \h </w:instrText>
+            </w:r>
+            <w:r>
+              <w:rPr>
+                <w:noProof/>
+                <w:webHidden/>
+              </w:rPr>
+            </w:r>
+            <w:r>
+              <w:rPr>
+                <w:noProof/>
+                <w:webHidden/>
+              </w:rPr>
+              <w:fldChar w:fldCharType="separate"/>
+            </w:r>
+            <w:r>
+              <w:rPr>
+                <w:noProof/>
+                <w:webHidden/>
+              </w:rPr>
+              <w:t>2</w:t>
+            </w:r>
+            <w:r>
+              <w:rPr>
+                <w:noProof/>
+                <w:webHidden/>
+              </w:rPr>
+              <w:fldChar w:fldCharType="end"/>
+            </w:r>
+          </w:hyperlink>
+        </w:p>
+        <w:p>
+          <w:pPr>
+            <w:pStyle w:val="TDC3"/>
+            <w:tabs>
+              <w:tab w:val="right" w:leader="dot" w:pos="9111"/>
+            </w:tabs>
+            <w:rPr>
+              <w:rFonts w:asciiTheme="minorHAnsi" w:eastAsiaTheme="minorEastAsia" w:hAnsiTheme="minorHAnsi" w:cstheme="minorBidi"/>
+              <w:noProof/>
+              <w:color w:val="auto"/>
+            </w:rPr>
+          </w:pPr>
+          <w:hyperlink w:anchor="_Toc240139310" w:history="1">
+            <w:r>
+              <w:rPr>
+                <w:rStyle w:val="Hipervnculo"/>
+                <w:noProof/>
+              </w:rPr>
+              <w:t>ATTO Disk Benchmark</w:t>
+            </w:r>
+            <w:r>
+              <w:rPr>
+                <w:noProof/>
+                <w:webHidden/>
+              </w:rPr>
+              <w:tab/>
+            </w:r>
+            <w:r>
+              <w:rPr>
+                <w:noProof/>
+                <w:webHidden/>
+              </w:rPr>
+              <w:fldChar w:fldCharType="begin"/>
+            </w:r>
+            <w:r>
+              <w:rPr>
+                <w:noProof/>
+                <w:webHidden/>
+              </w:rPr>
+              <w:instrText xml:space="preserve"> PAGEREF _Toc240139310 \h </w:instrText>
+            </w:r>
+            <w:r>
+              <w:rPr>
+                <w:noProof/>
+                <w:webHidden/>
+              </w:rPr>
+            </w:r>
+            <w:r>
+              <w:rPr>
+                <w:noProof/>
+                <w:webHidden/>
+              </w:rPr>
+              <w:fldChar w:fldCharType="separate"/>
+            </w:r>
+            <w:r>
+              <w:rPr>
+                <w:noProof/>
+                <w:webHidden/>
+              </w:rPr>
+              <w:t>2</w:t>
+            </w:r>
+            <w:r>
+              <w:rPr>
+                <w:noProof/>
+                <w:webHidden/>
+              </w:rPr>
+              <w:fldChar w:fldCharType="end"/>
+            </w:r>
+          </w:hyperlink>
+        </w:p>
+        <w:p>
+          <w:pPr>
+            <w:pStyle w:val="TDC3"/>
+            <w:tabs>
+              <w:tab w:val="right" w:leader="dot" w:pos="9111"/>
+            </w:tabs>
+            <w:rPr>
+              <w:rFonts w:asciiTheme="minorHAnsi" w:eastAsiaTheme="minorEastAsia" w:hAnsiTheme="minorHAnsi" w:cstheme="minorBidi"/>
+              <w:noProof/>
+              <w:color w:val="auto"/>
+            </w:rPr>
+          </w:pPr>
+          <w:hyperlink w:anchor="_Toc240139311" w:history="1">
+            <w:r>
+              <w:rPr>
+                <w:rStyle w:val="Hipervnculo"/>
+                <w:noProof/>
+              </w:rPr>
+              <w:t>AS SSD Benchmark</w:t>
+            </w:r>
+            <w:r>
+              <w:rPr>
+                <w:noProof/>
+                <w:webHidden/>
+              </w:rPr>
+              <w:tab/>
+            </w:r>
+            <w:r>
+              <w:rPr>
+                <w:noProof/>
+                <w:webHidden/>
+              </w:rPr>
+              <w:fldChar w:fldCharType="begin"/>
+            </w:r>
+            <w:r>
+              <w:rPr>
+                <w:noProof/>
+                <w:webHidden/>
+              </w:rPr>
+              <w:instrText xml:space="preserve"> PAGEREF _Toc240139311 \h </w:instrText>
+            </w:r>
+            <w:r>
+              <w:rPr>
+                <w:noProof/>
+                <w:webHidden/>
+              </w:rPr>
+            </w:r>
+            <w:r>
+              <w:rPr>
+                <w:noProof/>
+                <w:webHidden/>
+              </w:rPr>
+              <w:fldChar w:fldCharType="separate"/>
+            </w:r>
+            <w:r>
+              <w:rPr>
+                <w:noProof/>
+                <w:webHidden/>
+              </w:rPr>
+              <w:t>2</w:t>
+            </w:r>
+            <w:r>
+              <w:rPr>
+                <w:noProof/>
+                <w:webHidden/>
+              </w:rPr>
+              <w:fldChar w:fldCharType="end"/>
+            </w:r>
+          </w:hyperlink>
+        </w:p>
+        <w:p>
+          <w:pPr>
+            <w:pStyle w:val="TDC2"/>
+            <w:tabs>
+              <w:tab w:val="right" w:leader="dot" w:pos="9111"/>
+            </w:tabs>
+            <w:rPr>
+              <w:rFonts w:asciiTheme="minorHAnsi" w:eastAsiaTheme="minorEastAsia" w:hAnsiTheme="minorHAnsi" w:cstheme="minorBidi"/>
+              <w:noProof/>
+              <w:color w:val="auto"/>
+            </w:rPr>
+          </w:pPr>
+          <w:hyperlink w:anchor="_Toc240139312" w:history="1">
+            <w:r>
+              <w:rPr>
+                <w:rStyle w:val="Hipervnculo"/>
+                <w:noProof/>
+              </w:rPr>
+              <w:t>Tarjetas gráficas</w:t>
+            </w:r>
+            <w:r>
+              <w:rPr>
+                <w:noProof/>
+                <w:webHidden/>
+              </w:rPr>
+              <w:tab/>
+            </w:r>
+            <w:r>
+              <w:rPr>
+                <w:noProof/>
+                <w:webHidden/>
+              </w:rPr>
+              <w:fldChar w:fldCharType="begin"/>
+            </w:r>
+            <w:r>
+              <w:rPr>
+                <w:noProof/>
+                <w:webHidden/>
+              </w:rPr>
+              <w:instrText xml:space="preserve"> PAGEREF _Toc240139312 \h </w:instrText>
+            </w:r>
+            <w:r>
+              <w:rPr>
+                <w:noProof/>
+                <w:webHidden/>
+              </w:rPr>
+            </w:r>
+            <w:r>
+              <w:rPr>
+                <w:noProof/>
+                <w:webHidden/>
+              </w:rPr>
+              <w:fldChar w:fldCharType="separate"/>
+            </w:r>
+            <w:r>
+              <w:rPr>
+                <w:noProof/>
+                <w:webHidden/>
+              </w:rPr>
+              <w:t>2</w:t>
+            </w:r>
+            <w:r>
+              <w:rPr>
+                <w:noProof/>
+                <w:webHidden/>
+              </w:rPr>
+              <w:fldChar w:fldCharType="end"/>
+            </w:r>
+          </w:hyperlink>
+        </w:p>
+        <w:p>
+          <w:pPr>
+            <w:pStyle w:val="TDC3"/>
+            <w:tabs>
+              <w:tab w:val="right" w:leader="dot" w:pos="9111"/>
+            </w:tabs>
+            <w:rPr>
+              <w:rFonts w:asciiTheme="minorHAnsi" w:eastAsiaTheme="minorEastAsia" w:hAnsiTheme="minorHAnsi" w:cstheme="minorBidi"/>
+              <w:noProof/>
+              <w:color w:val="auto"/>
+            </w:rPr>
+          </w:pPr>
+          <w:hyperlink w:anchor="_Toc240139313" w:history="1">
+            <w:r>
+              <w:rPr>
+                <w:rStyle w:val="Hipervnculo"/>
+                <w:noProof/>
+              </w:rPr>
+              <w:t>3Dmark</w:t>
+            </w:r>
+            <w:r>
+              <w:rPr>
+                <w:noProof/>
+                <w:webHidden/>
+              </w:rPr>
+              <w:tab/>
+            </w:r>
+            <w:r>
+              <w:rPr>
+                <w:noProof/>
+                <w:webHidden/>
+              </w:rPr>
+              <w:fldChar w:fldCharType="begin"/>
+            </w:r>
+            <w:r>
+              <w:rPr>
+                <w:noProof/>
+                <w:webHidden/>
+              </w:rPr>
+              <w:instrText xml:space="preserve"> PAGEREF _Toc240139313 \h </w:instrText>
+            </w:r>
+            <w:r>
+              <w:rPr>
+                <w:noProof/>
+                <w:webHidden/>
+              </w:rPr>
+            </w:r>
+            <w:r>
+              <w:rPr>
+                <w:noProof/>
+                <w:webHidden/>
+              </w:rPr>
+              <w:fldChar w:fldCharType="separate"/>
+            </w:r>
+            <w:r>
+              <w:rPr>
+                <w:noProof/>
+                <w:webHidden/>
+              </w:rPr>
+              <w:t>2</w:t>
+            </w:r>
+            <w:r>
+              <w:rPr>
+                <w:noProof/>
+                <w:webHidden/>
+              </w:rPr>
+              <w:fldChar w:fldCharType="end"/>
+            </w:r>
+          </w:hyperlink>
+        </w:p>
+        <w:p>
+          <w:pPr>
+            <w:pStyle w:val="TDC3"/>
+            <w:tabs>
+              <w:tab w:val="right" w:leader="dot" w:pos="9111"/>
+            </w:tabs>
+            <w:rPr>
+              <w:rFonts w:asciiTheme="minorHAnsi" w:eastAsiaTheme="minorEastAsia" w:hAnsiTheme="minorHAnsi" w:cstheme="minorBidi"/>
+              <w:noProof/>
+              <w:color w:val="auto"/>
+            </w:rPr>
+          </w:pPr>
+          <w:hyperlink w:anchor="_Toc240139314" w:history="1">
+            <w:r>
+              <w:rPr>
+                <w:rStyle w:val="Hipervnculo"/>
+                <w:noProof/>
+              </w:rPr>
+              <w:t>Superposition Benchmark</w:t>
+            </w:r>
+            <w:r>
+              <w:rPr>
+                <w:noProof/>
+                <w:webHidden/>
+              </w:rPr>
+              <w:tab/>
+            </w:r>
+            <w:r>
+              <w:rPr>
+                <w:noProof/>
+                <w:webHidden/>
+              </w:rPr>
+              <w:fldChar w:fldCharType="begin"/>
+            </w:r>
+            <w:r>
+              <w:rPr>
+                <w:noProof/>
+                <w:webHidden/>
+              </w:rPr>
+              <w:instrText xml:space="preserve"> PAGEREF _Toc240139314 \h </w:instrText>
+            </w:r>
+            <w:r>
+              <w:rPr>
+                <w:noProof/>
+                <w:webHidden/>
+              </w:rPr>
+            </w:r>
+            <w:r>
+              <w:rPr>
+                <w:noProof/>
+                <w:webHidden/>
+              </w:rPr>
+              <w:fldChar w:fldCharType="separate"/>
+            </w:r>
+            <w:r>
+              <w:rPr>
+                <w:noProof/>
+                <w:webHidden/>
+              </w:rPr>
+              <w:t>2</w:t>
+            </w:r>
+            <w:r>
+              <w:rPr>
+                <w:noProof/>
+                <w:webHidden/>
+              </w:rPr>
+              <w:fldChar w:fldCharType="end"/>
+            </w:r>
+          </w:hyperlink>
+        </w:p>
+        <w:p>
+          <w:pPr>
+            <w:pStyle w:val="TDC3"/>
+            <w:tabs>
+              <w:tab w:val="right" w:leader="dot" w:pos="9111"/>
+            </w:tabs>
+            <w:rPr>
+              <w:rFonts w:asciiTheme="minorHAnsi" w:eastAsiaTheme="minorEastAsia" w:hAnsiTheme="minorHAnsi" w:cstheme="minorBidi"/>
+              <w:noProof/>
+              <w:color w:val="auto"/>
+            </w:rPr>
+          </w:pPr>
+          <w:hyperlink w:anchor="_Toc240139315" w:history="1">
+            <w:r>
+              <w:rPr>
+                <w:rStyle w:val="Hipervnculo"/>
+                <w:noProof/>
+              </w:rPr>
+              <w:t>FurMark</w:t>
+            </w:r>
+            <w:r>
+              <w:rPr>
+                <w:noProof/>
+                <w:webHidden/>
+              </w:rPr>
+              <w:tab/>
+            </w:r>
+            <w:r>
+              <w:rPr>
+                <w:noProof/>
+                <w:webHidden/>
+              </w:rPr>
+              <w:fldChar w:fldCharType="begin"/>
+            </w:r>
+            <w:r>
+              <w:rPr>
+                <w:noProof/>
+                <w:webHidden/>
+              </w:rPr>
+              <w:instrText xml:space="preserve"> PAGEREF _Toc240139315 \h </w:instrText>
+            </w:r>
+            <w:r>
+              <w:rPr>
+                <w:noProof/>
+                <w:webHidden/>
+              </w:rPr>
+            </w:r>
+            <w:r>
+              <w:rPr>
+                <w:noProof/>
+                <w:webHidden/>
+              </w:rPr>
+              <w:fldChar w:fldCharType="separate"/>
+            </w:r>
+            <w:r>
+              <w:rPr>
+                <w:noProof/>
+                <w:webHidden/>
+              </w:rPr>
+              <w:t>3</w:t>
+            </w:r>
+            <w:r>
+              <w:rPr>
+                <w:noProof/>
+                <w:webHidden/>
+              </w:rPr>
+              <w:fldChar w:fldCharType="end"/>
+            </w:r>
+          </w:hyperlink>
+        </w:p>
+        <w:p>
+          <w:pPr>
+            <w:pStyle w:val="TDC2"/>
+            <w:tabs>
+              <w:tab w:val="right" w:leader="dot" w:pos="9111"/>
+            </w:tabs>
+            <w:rPr>
+              <w:rFonts w:asciiTheme="minorHAnsi" w:eastAsiaTheme="minorEastAsia" w:hAnsiTheme="minorHAnsi" w:cstheme="minorBidi"/>
+              <w:noProof/>
+              <w:color w:val="auto"/>
+            </w:rPr>
+          </w:pPr>
+          <w:hyperlink w:anchor="_Toc240139316" w:history="1">
+            <w:r>
+              <w:rPr>
+                <w:rStyle w:val="Hipervnculo"/>
+                <w:noProof/>
+              </w:rPr>
+              <w:t>Características de mi PC</w:t>
+            </w:r>
+            <w:r>
+              <w:rPr>
+                <w:noProof/>
+                <w:webHidden/>
+              </w:rPr>
+              <w:tab/>
+            </w:r>
+            <w:r>
+              <w:rPr>
+                <w:noProof/>
+                <w:webHidden/>
+              </w:rPr>
+              <w:fldChar w:fldCharType="begin"/>
+            </w:r>
+            <w:r>
+              <w:rPr>
+                <w:noProof/>
+                <w:webHidden/>
+              </w:rPr>
+              <w:instrText xml:space="preserve"> PAGEREF _Toc240139316 \h </w:instrText>
+            </w:r>
+            <w:r>
+              <w:rPr>
+                <w:noProof/>
+                <w:webHidden/>
+              </w:rPr>
+            </w:r>
+            <w:r>
+              <w:rPr>
+                <w:noProof/>
+                <w:webHidden/>
+              </w:rPr>
+              <w:fldChar w:fldCharType="separate"/>
+            </w:r>
+            <w:r>
+              <w:rPr>
+                <w:noProof/>
+                <w:webHidden/>
+              </w:rPr>
+              <w:t>3</w:t>
             </w:r>
             <w:r>
               <w:rPr>
@@ -1692,13 +2796,13 @@
               <w:color w:val="auto"/>
             </w:rPr>
           </w:pPr>
-          <w:hyperlink w:anchor="_Toc220850611" w:history="1">
+          <w:hyperlink w:anchor="_Toc240139317" w:history="1">
             <w:r>
               <w:rPr>
                 <w:rStyle w:val="Hipervnculo"/>
                 <w:noProof/>
               </w:rPr>
-              <w:t>Desarrollo</w:t>
+              <w:t>Bibliografía</w:t>
             </w:r>
             <w:r>
               <w:rPr>
@@ -1719,7 +2823,7 @@
                 <w:noProof/>
                 <w:webHidden/>
               </w:rPr>
-              <w:instrText xml:space="preserve"> PAGEREF _Toc220850611 \h </w:instrText>
+              <w:instrText xml:space="preserve"> PAGEREF _Toc240139317 \h </w:instrText>
             </w:r>
             <w:r>
               <w:rPr>
@@ -1739,147 +2843,7 @@
                 <w:noProof/>
                 <w:webHidden/>
               </w:rPr>
-              <w:t>1</w:t>
-            </w:r>
-            <w:r>
-              <w:rPr>
-                <w:noProof/>
-                <w:webHidden/>
-              </w:rPr>
-              <w:fldChar w:fldCharType="end"/>
-            </w:r>
-          </w:hyperlink>
-        </w:p>
-        <w:p>
-          <w:pPr>
-            <w:pStyle w:val="TDC1"/>
-            <w:tabs>
-              <w:tab w:val="right" w:leader="dot" w:pos="9111"/>
-            </w:tabs>
-            <w:rPr>
-              <w:rFonts w:asciiTheme="minorHAnsi" w:eastAsiaTheme="minorEastAsia" w:hAnsiTheme="minorHAnsi" w:cstheme="minorBidi"/>
-              <w:noProof/>
-              <w:color w:val="auto"/>
-            </w:rPr>
-          </w:pPr>
-          <w:hyperlink w:anchor="_Toc220850612" w:history="1">
-            <w:r>
-              <w:rPr>
-                <w:rStyle w:val="Hipervnculo"/>
-                <w:noProof/>
-              </w:rPr>
-              <w:t>Conclusión</w:t>
-            </w:r>
-            <w:r>
-              <w:rPr>
-                <w:noProof/>
-                <w:webHidden/>
-              </w:rPr>
-              <w:tab/>
-            </w:r>
-            <w:r>
-              <w:rPr>
-                <w:noProof/>
-                <w:webHidden/>
-              </w:rPr>
-              <w:fldChar w:fldCharType="begin"/>
-            </w:r>
-            <w:r>
-              <w:rPr>
-                <w:noProof/>
-                <w:webHidden/>
-              </w:rPr>
-              <w:instrText xml:space="preserve"> PAGEREF _Toc220850612 \h </w:instrText>
-            </w:r>
-            <w:r>
-              <w:rPr>
-                <w:noProof/>
-                <w:webHidden/>
-              </w:rPr>
-            </w:r>
-            <w:r>
-              <w:rPr>
-                <w:noProof/>
-                <w:webHidden/>
-              </w:rPr>
-              <w:fldChar w:fldCharType="separate"/>
-            </w:r>
-            <w:r>
-              <w:rPr>
-                <w:noProof/>
-                <w:webHidden/>
-              </w:rPr>
-              <w:t>1</w:t>
-            </w:r>
-            <w:r>
-              <w:rPr>
-                <w:noProof/>
-                <w:webHidden/>
-              </w:rPr>
-              <w:fldChar w:fldCharType="end"/>
-            </w:r>
-          </w:hyperlink>
-        </w:p>
-        <w:p>
-          <w:pPr>
-            <w:pStyle w:val="TDC1"/>
-            <w:tabs>
-              <w:tab w:val="right" w:leader="dot" w:pos="9111"/>
-            </w:tabs>
-            <w:rPr>
-              <w:rFonts w:asciiTheme="minorHAnsi" w:eastAsiaTheme="minorEastAsia" w:hAnsiTheme="minorHAnsi" w:cstheme="minorBidi"/>
-              <w:noProof/>
-              <w:color w:val="auto"/>
-            </w:rPr>
-          </w:pPr>
-          <w:hyperlink w:anchor="_Toc220850613" w:history="1">
-            <w:r>
-              <w:rPr>
-                <w:rStyle w:val="Hipervnculo"/>
-                <w:noProof/>
-              </w:rPr>
-              <w:t>Bibliografía</w:t>
-            </w:r>
-            <w:r>
-              <w:rPr>
-                <w:noProof/>
-                <w:webHidden/>
-              </w:rPr>
-              <w:tab/>
-            </w:r>
-            <w:r>
-              <w:rPr>
-                <w:noProof/>
-                <w:webHidden/>
-              </w:rPr>
-              <w:fldChar w:fldCharType="begin"/>
-            </w:r>
-            <w:r>
-              <w:rPr>
-                <w:noProof/>
-                <w:webHidden/>
-              </w:rPr>
-              <w:instrText xml:space="preserve"> PAGEREF _Toc220850613 \h </w:instrText>
-            </w:r>
-            <w:r>
-              <w:rPr>
-                <w:noProof/>
-                <w:webHidden/>
-              </w:rPr>
-            </w:r>
-            <w:r>
-              <w:rPr>
-                <w:noProof/>
-                <w:webHidden/>
-              </w:rPr>
-              <w:fldChar w:fldCharType="separate"/>
-            </w:r>
-            <w:r>
-              <w:rPr>
-                <w:noProof/>
-                <w:webHidden/>
-              </w:rPr>
-              <w:t>1</w:t>
+              <w:t>4</w:t>
             </w:r>
             <w:r>
               <w:rPr>
@@ -1906,193 +2870,809 @@
       <w:pPr>
         <w:pStyle w:val="Ttulo1"/>
       </w:pPr>
-      <w:bookmarkStart w:id="1" w:name="_Toc220850610"/>
-      <w:r>
-        <w:t>Tabla de ilustraciones</w:t>
+      <w:bookmarkStart w:id="1" w:name="_Toc240139300"/>
+      <w:r>
+        <w:t>Benchmarks</w:t>
       </w:r>
       <w:bookmarkEnd w:id="1"/>
     </w:p>
     <w:p>
-      <w:r>
-        <w:fldChar w:fldCharType="begin"/>
-      </w:r>
-      <w:r>
-        <w:instrText xml:space="preserve"> TOC \h \z \c "Ilustración" </w:instrText>
-      </w:r>
-      <w:r>
-        <w:fldChar w:fldCharType="separate"/>
-      </w:r>
-      <w:r>
-        <w:rPr>
-          <w:b/>
-          <w:bCs/>
-          <w:noProof/>
-          <w:lang w:val="es-ES"/>
-        </w:rPr>
-        <w:t>No se encuentran elementos de tabla de ilustraciones.</w:t>
-      </w:r>
-      <w:r>
-        <w:rPr>
-          <w:b/>
-          <w:bCs/>
-          <w:noProof/>
-          <w:lang w:val="es-ES"/>
-        </w:rPr>
-        <w:fldChar w:fldCharType="end"/>
-      </w:r>
-    </w:p>
-    <w:p/>
-    <w:p>
-      <w:pPr>
-        <w:pStyle w:val="Ttulo1"/>
-      </w:pPr>
-      <w:proofErr w:type="spellStart"/>
-      <w:r>
-        <w:t>Benchmarks</w:t>
-      </w:r>
-      <w:proofErr w:type="spellEnd"/>
-    </w:p>
-    <w:p>
       <w:pPr>
         <w:pStyle w:val="Ttulo2"/>
       </w:pPr>
+      <w:bookmarkStart w:id="2" w:name="_Toc240139301"/>
       <w:r>
         <w:t>CPU</w:t>
-      </w:r>
-    </w:p>
-    <w:p>
-      <w:pPr>
-        <w:pStyle w:val="Ttulo3"/>
-      </w:pPr>
-      <w:proofErr w:type="spellStart"/>
-      <w:r>
-        <w:t>Cinebench</w:t>
-      </w:r>
-      <w:proofErr w:type="spellEnd"/>
-      <w:r>
-        <w:t xml:space="preserve"> </w:t>
-      </w:r>
-    </w:p>
-    <w:p>
-      <w:pPr>
-        <w:ind w:firstLine="708"/>
-      </w:pPr>
-      <w:r>
-        <w:t>Estándar actual para evaluar renderizado en 3D. Permite medir con precisión el rendimiento mononúcleo y multinúcleo.</w:t>
-      </w:r>
-    </w:p>
-    <w:p>
-      <w:pPr>
-        <w:pStyle w:val="Ttulo3"/>
-      </w:pPr>
-      <w:proofErr w:type="spellStart"/>
-      <w:r>
-        <w:t>Geekbench</w:t>
-      </w:r>
-      <w:proofErr w:type="spellEnd"/>
-      <w:r>
-        <w:t xml:space="preserve"> 7</w:t>
-      </w:r>
-    </w:p>
-    <w:p>
-      <w:pPr>
-        <w:ind w:firstLine="708"/>
-      </w:pPr>
-      <w:r>
-        <w:t>Muy popular por ser multiplataforma, se encarga de evaluar tareas cotidianas como procesamiento de imágenes, compresión de archivos y ejecución de código.</w:t>
-      </w:r>
-    </w:p>
-    <w:p>
-      <w:pPr>
-        <w:pStyle w:val="Ttulo3"/>
-      </w:pPr>
-      <w:r>
-        <w:t xml:space="preserve">CPU-Z </w:t>
-      </w:r>
-    </w:p>
-    <w:p>
-      <w:pPr>
-        <w:ind w:firstLine="708"/>
-      </w:pPr>
-      <w:r>
-        <w:t xml:space="preserve">Herramienta ligera y rápida para comparar instantáneamente el rendimiento mononúcleo y multinúcleo con una base de datos amplia de </w:t>
-      </w:r>
-      <w:proofErr w:type="spellStart"/>
-      <w:r>
-        <w:t>CPUs</w:t>
-      </w:r>
-      <w:proofErr w:type="spellEnd"/>
-      <w:r>
-        <w:t>.</w:t>
-      </w:r>
-    </w:p>
-    <w:p>
-      <w:pPr>
-        <w:pStyle w:val="Ttulo2"/>
-      </w:pPr>
-      <w:r>
-        <w:t>RAM</w:t>
-      </w:r>
-    </w:p>
-    <w:p>
-      <w:r>
-        <w:t xml:space="preserve">AIDA64 </w:t>
-      </w:r>
-    </w:p>
-    <w:p>
-      <w:r>
-        <w:t>Principal referente que m</w:t>
-      </w:r>
-      <w:r>
-        <w:t>ide con exactitud:</w:t>
-      </w:r>
-      <w:r>
-        <w:t xml:space="preserve"> v</w:t>
-      </w:r>
-      <w:r>
-        <w:t>elocidad de lectura, escritura</w:t>
-      </w:r>
-      <w:r>
-        <w:t>, copia y latencia.</w:t>
-      </w:r>
-    </w:p>
-    <w:p>
-      <w:r>
-        <w:t>MaxxMEM²: Una alternativa gratuita y ligera que calcula el ancho de banda y la latencia del subsistema de memoria.</w:t>
-      </w:r>
-    </w:p>
-    <w:p>
-      <w:pPr>
-        <w:pStyle w:val="Ttulo1"/>
-      </w:pPr>
-      <w:bookmarkStart w:id="2" w:name="_Toc220850612"/>
-      <w:r>
-        <w:lastRenderedPageBreak/>
-        <w:t>Conclusión</w:t>
       </w:r>
       <w:bookmarkEnd w:id="2"/>
     </w:p>
     <w:p>
       <w:pPr>
-        <w:spacing w:before="120" w:after="0"/>
-      </w:pPr>
-      <w:r>
-        <w:t>Hola soy una conclusión</w:t>
+        <w:pStyle w:val="Ttulo3"/>
+      </w:pPr>
+      <w:bookmarkStart w:id="3" w:name="_Toc240139302"/>
+      <w:r>
+        <w:t>Cinebench</w:t>
+      </w:r>
+      <w:bookmarkEnd w:id="3"/>
+      <w:r>
+        <w:t xml:space="preserve"> </w:t>
       </w:r>
     </w:p>
     <w:p>
       <w:pPr>
-        <w:pStyle w:val="Ttulo1"/>
-      </w:pPr>
-      <w:bookmarkStart w:id="3" w:name="_Toc220850613"/>
-      <w:r>
-        <w:t>Bibliografía</w:t>
-      </w:r>
-      <w:bookmarkEnd w:id="3"/>
+        <w:ind w:firstLine="708"/>
+      </w:pPr>
+      <w:r>
+        <w:t>Estándar actual para evaluar renderizado en 3D. Permite medir con precisión el rendimiento mononúcleo y multinúcleo.</w:t>
+      </w:r>
     </w:p>
     <w:p>
-      <w:r>
-        <w:t>Hola soy una bibliografía en formato APA</w:t>
+      <w:pPr>
+        <w:pStyle w:val="Ttulo3"/>
+      </w:pPr>
+      <w:bookmarkStart w:id="4" w:name="_Toc240139303"/>
+      <w:r>
+        <w:t>Geekbench 7</w:t>
+      </w:r>
+      <w:bookmarkEnd w:id="4"/>
+    </w:p>
+    <w:p>
+      <w:pPr>
+        <w:ind w:firstLine="708"/>
+      </w:pPr>
+      <w:r>
+        <w:t>Muy popular por ser multiplataforma, se encarga de evaluar tareas cotidianas como procesamiento de imágenes, compresión de archivos y ejecución de código.</w:t>
+      </w:r>
+    </w:p>
+    <w:p>
+      <w:pPr>
+        <w:pStyle w:val="Ttulo3"/>
+      </w:pPr>
+      <w:bookmarkStart w:id="5" w:name="_Toc240139304"/>
+      <w:r>
+        <w:lastRenderedPageBreak/>
+        <w:t>CPU-Z</w:t>
+      </w:r>
+      <w:bookmarkEnd w:id="5"/>
+      <w:r>
+        <w:t xml:space="preserve"> </w:t>
+      </w:r>
+    </w:p>
+    <w:p>
+      <w:pPr>
+        <w:ind w:firstLine="708"/>
+      </w:pPr>
+      <w:r>
+        <w:t>Herramienta ligera y rápida para comparar instantáneamente el rendimiento mononúcleo y multinúcleo con una base de datos amplia de CPUs.</w:t>
+      </w:r>
+    </w:p>
+    <w:p>
+      <w:pPr>
+        <w:pStyle w:val="Ttulo2"/>
+      </w:pPr>
+      <w:bookmarkStart w:id="6" w:name="_Toc240139305"/>
+      <w:r>
+        <w:t>RAM</w:t>
+      </w:r>
+      <w:bookmarkEnd w:id="6"/>
+    </w:p>
+    <w:p>
+      <w:pPr>
+        <w:pStyle w:val="Ttulo3"/>
+      </w:pPr>
+      <w:bookmarkStart w:id="7" w:name="_Toc240139306"/>
+      <w:r>
+        <w:t>AIDA64</w:t>
+      </w:r>
+      <w:bookmarkEnd w:id="7"/>
+      <w:r>
+        <w:t xml:space="preserve"> </w:t>
+      </w:r>
+    </w:p>
+    <w:p>
+      <w:pPr>
+        <w:ind w:firstLine="708"/>
+      </w:pPr>
+      <w:r>
+        <w:t>Principal referente que mide con exactitud: velocidad de lectura, escritura, copia y latencia.</w:t>
+      </w:r>
+    </w:p>
+    <w:p>
+      <w:pPr>
+        <w:pStyle w:val="Ttulo3"/>
+      </w:pPr>
+      <w:bookmarkStart w:id="8" w:name="_Toc240139307"/>
+      <w:r>
+        <w:t>MaxxMEM²</w:t>
+      </w:r>
+      <w:bookmarkEnd w:id="8"/>
+    </w:p>
+    <w:p>
+      <w:pPr>
+        <w:ind w:firstLine="708"/>
+      </w:pPr>
+      <w:r>
+        <w:t>Una alternativa gratuita y ligera que calcula el ancho de banda y la latencia del subsistema de memoria.</w:t>
+      </w:r>
+    </w:p>
+    <w:p>
+      <w:pPr>
+        <w:pStyle w:val="Ttulo2"/>
+      </w:pPr>
+      <w:bookmarkStart w:id="9" w:name="_Toc240139308"/>
+      <w:r>
+        <w:t>Unidades de almacenamiento</w:t>
+      </w:r>
+      <w:bookmarkEnd w:id="9"/>
+      <w:r>
+        <w:t xml:space="preserve"> </w:t>
+      </w:r>
+    </w:p>
+    <w:p>
+      <w:pPr>
+        <w:pStyle w:val="Ttulo3"/>
+      </w:pPr>
+      <w:bookmarkStart w:id="10" w:name="_Toc240139309"/>
+      <w:r>
+        <w:t>CrystalDiskMark</w:t>
+      </w:r>
+      <w:bookmarkEnd w:id="10"/>
+    </w:p>
+    <w:p>
+      <w:r>
+        <w:tab/>
+        <w:t>Software muy utilizado para medir: velocidades secuenciales, como transferencia de archivos grandes y velocidades aleatorias, al aplicarlo a operar con bloques pequeños a baja profundidad de cola.</w:t>
+      </w:r>
+    </w:p>
+    <w:p>
+      <w:pPr>
+        <w:pStyle w:val="Ttulo3"/>
+      </w:pPr>
+      <w:bookmarkStart w:id="11" w:name="_Toc240139310"/>
+      <w:r>
+        <w:t>ATTO Disk Benchmark</w:t>
+      </w:r>
+      <w:bookmarkEnd w:id="11"/>
+    </w:p>
+    <w:p>
+      <w:r>
+        <w:tab/>
+        <w:t>Mide el rendimiento a través de diferentes tamaños de bloque, mostrando en qué tamaño de archivo la unidad alcanza su velocidad máxima.</w:t>
+      </w:r>
+    </w:p>
+    <w:p>
+      <w:pPr>
+        <w:pStyle w:val="Ttulo3"/>
+      </w:pPr>
+      <w:bookmarkStart w:id="12" w:name="_Toc240139311"/>
+      <w:r>
+        <w:t>AS SSD Benchmark</w:t>
+      </w:r>
+      <w:bookmarkEnd w:id="12"/>
+    </w:p>
+    <w:p>
+      <w:pPr>
+        <w:ind w:firstLine="708"/>
+      </w:pPr>
+      <w:r>
+        <w:t>Similar</w:t>
+      </w:r>
+      <w:r>
+        <w:t xml:space="preserve"> a CrystalKiskMark, pero enfocado exclusivamente en SSDs; utiliza datos no comprimibles para evaluar el controlador del disco y otorga un puntaje global.</w:t>
+      </w:r>
+    </w:p>
+    <w:p>
+      <w:pPr>
+        <w:pStyle w:val="Ttulo2"/>
+      </w:pPr>
+      <w:bookmarkStart w:id="13" w:name="_Toc240139312"/>
+      <w:r>
+        <w:t>Tarjetas gráficas</w:t>
+      </w:r>
+      <w:bookmarkEnd w:id="13"/>
+      <w:r>
+        <w:t xml:space="preserve"> </w:t>
+      </w:r>
+    </w:p>
+    <w:p>
+      <w:pPr>
+        <w:pStyle w:val="Ttulo3"/>
+      </w:pPr>
+      <w:bookmarkStart w:id="14" w:name="_Toc240139313"/>
+      <w:r>
+        <w:t>3Dmark</w:t>
+      </w:r>
+      <w:bookmarkEnd w:id="14"/>
+    </w:p>
+    <w:p>
+      <w:r>
+        <w:t>Mide el rendimiento de:</w:t>
+      </w:r>
+    </w:p>
+    <w:p>
+      <w:pPr>
+        <w:pStyle w:val="Prrafodelista"/>
+        <w:numPr>
+          <w:ilvl w:val="0"/>
+          <w:numId w:val="33"/>
+        </w:numPr>
+      </w:pPr>
+      <w:r>
+        <w:t>Gráficos en DirectX12 a resoluciones 11440p y 4k.</w:t>
+      </w:r>
+    </w:p>
+    <w:p>
+      <w:pPr>
+        <w:pStyle w:val="Prrafodelista"/>
+        <w:numPr>
+          <w:ilvl w:val="0"/>
+          <w:numId w:val="33"/>
+        </w:numPr>
+      </w:pPr>
+      <w:r>
+        <w:t xml:space="preserve">Renderizado en DirectX11. </w:t>
+      </w:r>
+    </w:p>
+    <w:p>
+      <w:pPr>
+        <w:pStyle w:val="Prrafodelista"/>
+        <w:numPr>
+          <w:ilvl w:val="0"/>
+          <w:numId w:val="33"/>
+        </w:numPr>
+      </w:pPr>
+      <w:r>
+        <w:t>Pruebas específicas para Ray Tracing y tecnologías DirectX 12 Ultimate.</w:t>
+      </w:r>
+    </w:p>
+    <w:p>
+      <w:pPr>
+        <w:pStyle w:val="Ttulo3"/>
+      </w:pPr>
+      <w:bookmarkStart w:id="15" w:name="_Toc240139314"/>
+      <w:r>
+        <w:t>Superposition Benchmark</w:t>
+      </w:r>
+      <w:bookmarkEnd w:id="15"/>
+    </w:p>
+    <w:p>
+      <w:pPr>
+        <w:ind w:firstLine="708"/>
+      </w:pPr>
+      <w:r>
+        <w:t>Prueba muy exigente basada en el motor UNGINE 2, ideal para medir gráfica en rasterizado puro a distintas resoluciones.</w:t>
+      </w:r>
+    </w:p>
+    <w:p>
+      <w:pPr>
+        <w:pStyle w:val="Ttulo3"/>
+      </w:pPr>
+      <w:bookmarkStart w:id="16" w:name="_Toc240139315"/>
+      <w:r>
+        <w:lastRenderedPageBreak/>
+        <w:t>FurMark</w:t>
+      </w:r>
+      <w:bookmarkEnd w:id="16"/>
+    </w:p>
+    <w:p>
+      <w:pPr>
+        <w:rPr>
+          <w:iCs/>
+        </w:rPr>
+      </w:pPr>
+      <w:r>
+        <w:tab/>
+        <w:t xml:space="preserve">Genera estrés térmico extremo, que se le conoce como </w:t>
+      </w:r>
+      <w:r>
+        <w:rPr>
+          <w:i/>
+        </w:rPr>
+        <w:t xml:space="preserve">power virus. </w:t>
+      </w:r>
+      <w:r>
+        <w:rPr>
+          <w:iCs/>
+        </w:rPr>
+        <w:t>Se utiliza principalmente para comprobar la estabilidad de voltajes, consumo eléctrico máximo y temperaturas límite de la GPU.</w:t>
+      </w:r>
+    </w:p>
+    <w:p>
+      <w:pPr>
+        <w:pStyle w:val="Ttulo2"/>
+      </w:pPr>
+      <w:bookmarkStart w:id="17" w:name="_Toc240139316"/>
+      <w:r>
+        <w:t>Características de mi PC</w:t>
+      </w:r>
+      <w:bookmarkEnd w:id="17"/>
+    </w:p>
+    <w:p>
+      <w:pPr>
+        <w:pStyle w:val="Prrafodelista"/>
+        <w:numPr>
+          <w:ilvl w:val="0"/>
+          <w:numId w:val="34"/>
+        </w:numPr>
+      </w:pPr>
+      <w:r>
+        <w:t>Velocidad del procesador:</w:t>
+      </w:r>
+    </w:p>
+    <w:p>
+      <w:pPr>
+        <w:pStyle w:val="Prrafodelista"/>
+        <w:numPr>
+          <w:ilvl w:val="1"/>
+          <w:numId w:val="34"/>
+        </w:numPr>
+      </w:pPr>
+      <w:r>
+        <w:t>Frecuencia de reloj: 3.5 GHz – 4.4 GHz</w:t>
+      </w:r>
+      <w:r>
+        <w:t>.</w:t>
+      </w:r>
+    </w:p>
+    <w:p>
+      <w:pPr>
+        <w:pStyle w:val="Prrafodelista"/>
+        <w:numPr>
+          <w:ilvl w:val="1"/>
+          <w:numId w:val="34"/>
+        </w:numPr>
+      </w:pPr>
+      <w:r>
+        <w:t>Núcleos e hilos: 6 núcleos y 12 hilos.</w:t>
+      </w:r>
+    </w:p>
+    <w:p>
+      <w:pPr>
+        <w:pStyle w:val="Prrafodelista"/>
+        <w:numPr>
+          <w:ilvl w:val="0"/>
+          <w:numId w:val="34"/>
+        </w:numPr>
+      </w:pPr>
+      <w:r>
+        <w:t>Memoria RAM</w:t>
+      </w:r>
+      <w:r>
+        <w:t>:</w:t>
+      </w:r>
+    </w:p>
+    <w:p>
+      <w:pPr>
+        <w:pStyle w:val="Prrafodelista"/>
+        <w:numPr>
+          <w:ilvl w:val="1"/>
+          <w:numId w:val="34"/>
+        </w:numPr>
+      </w:pPr>
+      <w:r>
+        <w:t>Capacidad: 16 GB (8 x 2).</w:t>
+      </w:r>
+    </w:p>
+    <w:p>
+      <w:pPr>
+        <w:pStyle w:val="Prrafodelista"/>
+        <w:numPr>
+          <w:ilvl w:val="1"/>
+          <w:numId w:val="34"/>
+        </w:numPr>
+      </w:pPr>
+      <w:r>
+        <w:t>Velocidad: 3200 MHz.</w:t>
+      </w:r>
+    </w:p>
+    <w:p>
+      <w:pPr>
+        <w:pStyle w:val="Prrafodelista"/>
+        <w:numPr>
+          <w:ilvl w:val="0"/>
+          <w:numId w:val="34"/>
+        </w:numPr>
+      </w:pPr>
+      <w:r>
+        <w:t>Almacenamiento</w:t>
+      </w:r>
+      <w:r>
+        <w:t>:</w:t>
+      </w:r>
+    </w:p>
+    <w:p>
+      <w:pPr>
+        <w:pStyle w:val="Prrafodelista"/>
+        <w:numPr>
+          <w:ilvl w:val="1"/>
+          <w:numId w:val="34"/>
+        </w:numPr>
+      </w:pPr>
+      <w:r>
+        <w:t>Tipo de almacenamiento: SSD.</w:t>
+      </w:r>
+    </w:p>
+    <w:p>
+      <w:pPr>
+        <w:pStyle w:val="Prrafodelista"/>
+        <w:numPr>
+          <w:ilvl w:val="1"/>
+          <w:numId w:val="34"/>
+        </w:numPr>
+      </w:pPr>
+      <w:r>
+        <w:t xml:space="preserve">Velocidad de lectura/escritura: </w:t>
+      </w:r>
+      <w:r>
+        <w:t>3.500/2.200Mb/seg</w:t>
+      </w:r>
+      <w:r>
+        <w:t>.</w:t>
+      </w:r>
+    </w:p>
+    <w:p>
+      <w:pPr>
+        <w:pStyle w:val="Prrafodelista"/>
+        <w:numPr>
+          <w:ilvl w:val="0"/>
+          <w:numId w:val="34"/>
+        </w:numPr>
+      </w:pPr>
+      <w:r>
+        <w:t>Tarjeta gráfica</w:t>
+      </w:r>
+      <w:r>
+        <w:t>:</w:t>
+      </w:r>
+    </w:p>
+    <w:p>
+      <w:pPr>
+        <w:pStyle w:val="Prrafodelista"/>
+        <w:numPr>
+          <w:ilvl w:val="1"/>
+          <w:numId w:val="34"/>
+        </w:numPr>
+      </w:pPr>
+      <w:r>
+        <w:t xml:space="preserve">Frecuencia de reloj: </w:t>
+      </w:r>
+      <w:r>
+        <w:t>1.83 GH – 2.46 GHz.</w:t>
+      </w:r>
+    </w:p>
+    <w:p>
+      <w:pPr>
+        <w:pStyle w:val="Prrafodelista"/>
+        <w:numPr>
+          <w:ilvl w:val="1"/>
+          <w:numId w:val="34"/>
+        </w:numPr>
+      </w:pPr>
+      <w:r>
+        <w:t xml:space="preserve">VRAM: 8 GB GDDR6 </w:t>
+      </w:r>
+    </w:p>
+    <w:p>
+      <w:pPr>
+        <w:pStyle w:val="Prrafodelista"/>
+        <w:numPr>
+          <w:ilvl w:val="1"/>
+          <w:numId w:val="34"/>
+        </w:numPr>
+      </w:pPr>
+      <w:r>
+        <w:t xml:space="preserve">Arquitectura de la GPU: </w:t>
+      </w:r>
+      <w:r>
+        <w:t>Ada Lovelace</w:t>
+      </w:r>
+    </w:p>
+    <w:p>
+      <w:pPr>
+        <w:pStyle w:val="Prrafodelista"/>
+        <w:numPr>
+          <w:ilvl w:val="1"/>
+          <w:numId w:val="34"/>
+        </w:numPr>
+      </w:pPr>
+      <w:r>
+        <w:t>FPS:</w:t>
+      </w:r>
+      <w:r>
+        <w:t xml:space="preserve"> Aproximadamente 82 FPS para 1080p.</w:t>
+      </w:r>
+    </w:p>
+    <w:p>
+      <w:pPr>
+        <w:pStyle w:val="Prrafodelista"/>
+        <w:numPr>
+          <w:ilvl w:val="0"/>
+          <w:numId w:val="34"/>
+        </w:numPr>
+      </w:pPr>
+      <w:r>
+        <w:t>Ancho de banda y latencia de red</w:t>
+      </w:r>
+      <w:r>
+        <w:t>:</w:t>
+      </w:r>
+    </w:p>
+    <w:p>
+      <w:pPr>
+        <w:pStyle w:val="Prrafodelista"/>
+        <w:numPr>
+          <w:ilvl w:val="1"/>
+          <w:numId w:val="34"/>
+        </w:numPr>
+      </w:pPr>
+      <w:r>
+        <w:t>Velocidad de descarga: 117.94 Mbps.</w:t>
+      </w:r>
+    </w:p>
+    <w:p>
+      <w:pPr>
+        <w:pStyle w:val="Prrafodelista"/>
+        <w:numPr>
+          <w:ilvl w:val="1"/>
+          <w:numId w:val="34"/>
+        </w:numPr>
+      </w:pPr>
+      <w:r>
+        <w:t>Velocidad de subida: 126.88 Mbps.</w:t>
+      </w:r>
+    </w:p>
+    <w:p>
+      <w:pPr>
+        <w:pStyle w:val="Prrafodelista"/>
+        <w:numPr>
+          <w:ilvl w:val="1"/>
+          <w:numId w:val="34"/>
+        </w:numPr>
+      </w:pPr>
+      <w:r>
+        <w:t>Latencia: 6 ms.</w:t>
+      </w:r>
+    </w:p>
+    <w:p>
+      <w:pPr>
+        <w:pStyle w:val="Prrafodelista"/>
+        <w:numPr>
+          <w:ilvl w:val="0"/>
+          <w:numId w:val="34"/>
+        </w:numPr>
+      </w:pPr>
+      <w:r>
+        <w:t>Poder de cálculo</w:t>
+      </w:r>
+      <w:r>
+        <w:t>:</w:t>
+      </w:r>
+    </w:p>
+    <w:p>
+      <w:pPr>
+        <w:pStyle w:val="Prrafodelista"/>
+        <w:numPr>
+          <w:ilvl w:val="1"/>
+          <w:numId w:val="34"/>
+        </w:numPr>
+      </w:pPr>
+      <w:r>
+        <w:t>FLOPS: Aproximadamente 422.4 GFLOPS.</w:t>
+      </w:r>
+    </w:p>
+    <w:p>
+      <w:pPr>
+        <w:pStyle w:val="Prrafodelista"/>
+        <w:numPr>
+          <w:ilvl w:val="1"/>
+          <w:numId w:val="34"/>
+        </w:numPr>
+      </w:pPr>
+      <w:r>
+        <w:t>MIPS: Aproximadamente 65,000 y 75,000 MIPS.</w:t>
+      </w:r>
+    </w:p>
+    <w:p>
+      <w:pPr>
+        <w:pStyle w:val="Prrafodelista"/>
+        <w:numPr>
+          <w:ilvl w:val="0"/>
+          <w:numId w:val="34"/>
+        </w:numPr>
+      </w:pPr>
+      <w:r>
+        <w:t>Eficiencia energética</w:t>
+      </w:r>
+      <w:r>
+        <w:t>:</w:t>
+      </w:r>
+    </w:p>
+    <w:p>
+      <w:pPr>
+        <w:pStyle w:val="Prrafodelista"/>
+        <w:numPr>
+          <w:ilvl w:val="1"/>
+          <w:numId w:val="34"/>
+        </w:numPr>
+      </w:pPr>
+      <w:r>
+        <w:t>En promedio 20 W.</w:t>
+      </w:r>
+    </w:p>
+    <w:p>
+      <w:pPr>
+        <w:pStyle w:val="Prrafodelista"/>
+        <w:numPr>
+          <w:ilvl w:val="0"/>
+          <w:numId w:val="34"/>
+        </w:numPr>
+      </w:pPr>
+      <w:r>
+        <w:t>Velocidad de arranque</w:t>
+      </w:r>
+      <w:r>
+        <w:t>: 8.1 s.</w:t>
+      </w:r>
+    </w:p>
+    <w:p>
+      <w:pPr>
+        <w:pStyle w:val="Prrafodelista"/>
+        <w:numPr>
+          <w:ilvl w:val="0"/>
+          <w:numId w:val="34"/>
+        </w:numPr>
+      </w:pPr>
+      <w:r>
+        <w:t>Temperaturas y gestión térmica</w:t>
+      </w:r>
+      <w:r>
+        <w:t>:</w:t>
+      </w:r>
+    </w:p>
+    <w:p>
+      <w:pPr>
+        <w:pStyle w:val="Prrafodelista"/>
+        <w:numPr>
+          <w:ilvl w:val="1"/>
+          <w:numId w:val="34"/>
+        </w:numPr>
+      </w:pPr>
+      <w:r>
+        <w:t>CPU: En promedio 40 °C.</w:t>
+      </w:r>
+    </w:p>
+    <w:p>
+      <w:pPr>
+        <w:pStyle w:val="Prrafodelista"/>
+        <w:numPr>
+          <w:ilvl w:val="1"/>
+          <w:numId w:val="34"/>
+        </w:numPr>
+      </w:pPr>
+      <w:r>
+        <w:t>GPU: En promedio 45 °C.</w:t>
+      </w:r>
+    </w:p>
+    <w:p>
+      <w:pPr>
+        <w:pStyle w:val="Prrafodelista"/>
+        <w:numPr>
+          <w:ilvl w:val="0"/>
+          <w:numId w:val="34"/>
+        </w:numPr>
+      </w:pPr>
+      <w:r>
+        <w:t>Sistema operativo y software</w:t>
+      </w:r>
+      <w:r>
+        <w:t>:</w:t>
+      </w:r>
+    </w:p>
+    <w:p>
+      <w:pPr>
+        <w:pStyle w:val="Prrafodelista"/>
+        <w:numPr>
+          <w:ilvl w:val="1"/>
+          <w:numId w:val="34"/>
+        </w:numPr>
+      </w:pPr>
+      <w:r>
+        <w:t>Sistema operativo: Windows 11.</w:t>
+      </w:r>
+    </w:p>
+    <w:p>
+      <w:pPr>
+        <w:pStyle w:val="Prrafodelista"/>
+        <w:numPr>
+          <w:ilvl w:val="1"/>
+          <w:numId w:val="34"/>
+        </w:numPr>
+      </w:pPr>
+      <w:r>
+        <w:t>Aplicaciones de arranque:</w:t>
+      </w:r>
+    </w:p>
+    <w:p>
+      <w:pPr>
+        <w:pStyle w:val="Prrafodelista"/>
+        <w:numPr>
+          <w:ilvl w:val="2"/>
+          <w:numId w:val="34"/>
+        </w:numPr>
+      </w:pPr>
+      <w:r>
+        <w:t>Spotify</w:t>
+      </w:r>
+    </w:p>
+    <w:p>
+      <w:pPr>
+        <w:pStyle w:val="Prrafodelista"/>
+        <w:numPr>
+          <w:ilvl w:val="2"/>
+          <w:numId w:val="34"/>
+        </w:numPr>
+      </w:pPr>
+      <w:r>
+        <w:t>Discord</w:t>
+      </w:r>
+    </w:p>
+    <w:p>
+      <w:pPr>
+        <w:pStyle w:val="Prrafodelista"/>
+        <w:numPr>
+          <w:ilvl w:val="2"/>
+          <w:numId w:val="34"/>
+        </w:numPr>
+      </w:pPr>
+      <w:r>
+        <w:t>Whatsapp</w:t>
+      </w:r>
+    </w:p>
+    <w:p>
+      <w:pPr>
+        <w:pStyle w:val="Prrafodelista"/>
+        <w:numPr>
+          <w:ilvl w:val="2"/>
+          <w:numId w:val="34"/>
+        </w:numPr>
+      </w:pPr>
+      <w:r>
+        <w:t>Servicios generales de Windows.</w:t>
+      </w:r>
+    </w:p>
+    <w:p>
+      <w:pPr>
+        <w:pStyle w:val="Ttulo1"/>
+      </w:pPr>
+      <w:bookmarkStart w:id="18" w:name="_Toc240139317"/>
+      <w:r>
+        <w:lastRenderedPageBreak/>
+        <w:t>Bibliografía</w:t>
+      </w:r>
+      <w:bookmarkEnd w:id="18"/>
+    </w:p>
+    <w:p>
+      <w:pPr>
+        <w:pStyle w:val="Prrafodelista"/>
+        <w:numPr>
+          <w:ilvl w:val="0"/>
+          <w:numId w:val="35"/>
+        </w:numPr>
+      </w:pPr>
+      <w:r>
+        <w:t xml:space="preserve">Nv, E., &amp; Ssd De Kingston, N. (s/f). Rendimiento eficiente para portátiles y sistemas más delgados. Kingston.com. Recuperado el 13 de septiembre de 2026, de </w:t>
+      </w:r>
+      <w:hyperlink r:id="rId12" w:history="1">
+        <w:r>
+          <w:rPr>
+            <w:rStyle w:val="Hipervnculo"/>
+          </w:rPr>
+          <w:t>https://www.kingston.com/datasheets/SNV2S_latam.pdf</w:t>
+        </w:r>
+      </w:hyperlink>
+      <w:r>
+        <w:t xml:space="preserve"> </w:t>
       </w:r>
     </w:p>
     <w:p/>
@@ -2104,12 +3684,11 @@
     <w:p/>
     <w:p/>
     <w:p/>
-    <w:p/>
     <w:sectPr>
-      <w:headerReference w:type="even" r:id="rId12"/>
-      <w:headerReference w:type="default" r:id="rId13"/>
-      <w:footerReference w:type="even" r:id="rId14"/>
-      <w:footerReference w:type="default" r:id="rId15"/>
+      <w:headerReference w:type="even" r:id="rId13"/>
+      <w:headerReference w:type="default" r:id="rId14"/>
+      <w:footerReference w:type="even" r:id="rId15"/>
+      <w:footerReference w:type="default" r:id="rId16"/>
       <w:pgSz w:w="12240" w:h="15840"/>
       <w:pgMar w:top="1418" w:right="1134" w:bottom="1418" w:left="1701" w:header="720" w:footer="720" w:gutter="284"/>
       <w:pgBorders w:offsetFrom="page">
@@ -3914,6 +5493,119 @@
     </w:lvl>
   </w:abstractNum>
   <w:abstractNum w:abstractNumId="15" w15:restartNumberingAfterBreak="0">
+    <w:nsid w:val="3C2B7C18"/>
+    <w:multiLevelType w:val="hybridMultilevel"/>
+    <w:tmpl w:val="033E9D58"/>
+    <w:lvl w:ilvl="0" w:tplc="080A0001">
+      <w:start w:val="1"/>
+      <w:numFmt w:val="bullet"/>
+      <w:lvlText w:val=""/>
+      <w:lvlJc w:val="left"/>
+      <w:pPr>
+        <w:ind w:left="720" w:hanging="360"/>
+      </w:pPr>
+      <w:rPr>
+        <w:rFonts w:ascii="Symbol" w:hAnsi="Symbol" w:hint="default"/>
+      </w:rPr>
+    </w:lvl>
+    <w:lvl w:ilvl="1" w:tplc="080A0003" w:tentative="1">
+      <w:start w:val="1"/>
+      <w:numFmt w:val="bullet"/>
+      <w:lvlText w:val="o"/>
+      <w:lvlJc w:val="left"/>
+      <w:pPr>
+        <w:ind w:left="1440" w:hanging="360"/>
+      </w:pPr>
+      <w:rPr>
+        <w:rFonts w:ascii="Courier New" w:hAnsi="Courier New" w:cs="Courier New" w:hint="default"/>
+      </w:rPr>
+    </w:lvl>
+    <w:lvl w:ilvl="2" w:tplc="080A0005" w:tentative="1">
+      <w:start w:val="1"/>
+      <w:numFmt w:val="bullet"/>
+      <w:lvlText w:val=""/>
+      <w:lvlJc w:val="left"/>
+      <w:pPr>
+        <w:ind w:left="2160" w:hanging="360"/>
+      </w:pPr>
+      <w:rPr>
+        <w:rFonts w:ascii="Wingdings" w:hAnsi="Wingdings" w:hint="default"/>
+      </w:rPr>
+    </w:lvl>
+    <w:lvl w:ilvl="3" w:tplc="080A0001" w:tentative="1">
+      <w:start w:val="1"/>
+      <w:numFmt w:val="bullet"/>
+      <w:lvlText w:val=""/>
+      <w:lvlJc w:val="left"/>
+      <w:pPr>
+        <w:ind w:left="2880" w:hanging="360"/>
+      </w:pPr>
+      <w:rPr>
+        <w:rFonts w:ascii="Symbol" w:hAnsi="Symbol" w:hint="default"/>
+      </w:rPr>
+    </w:lvl>
+    <w:lvl w:ilvl="4" w:tplc="080A0003" w:tentative="1">
+      <w:start w:val="1"/>
+      <w:numFmt w:val="bullet"/>
+      <w:lvlText w:val="o"/>
+      <w:lvlJc w:val="left"/>
+      <w:pPr>
+        <w:ind w:left="3600" w:hanging="360"/>
+      </w:pPr>
+      <w:rPr>
+        <w:rFonts w:ascii="Courier New" w:hAnsi="Courier New" w:cs="Courier New" w:hint="default"/>
+      </w:rPr>
+    </w:lvl>
+    <w:lvl w:ilvl="5" w:tplc="080A0005" w:tentative="1">
+      <w:start w:val="1"/>
+      <w:numFmt w:val="bullet"/>
+      <w:lvlText w:val=""/>
+      <w:lvlJc w:val="left"/>
+      <w:pPr>
+        <w:ind w:left="4320" w:hanging="360"/>
+      </w:pPr>
+      <w:rPr>
+        <w:rFonts w:ascii="Wingdings" w:hAnsi="Wingdings" w:hint="default"/>
+      </w:rPr>
+    </w:lvl>
+    <w:lvl w:ilvl="6" w:tplc="080A0001" w:tentative="1">
+      <w:start w:val="1"/>
+      <w:numFmt w:val="bullet"/>
+      <w:lvlText w:val=""/>
+      <w:lvlJc w:val="left"/>
+      <w:pPr>
+        <w:ind w:left="5040" w:hanging="360"/>
+      </w:pPr>
+      <w:rPr>
+        <w:rFonts w:ascii="Symbol" w:hAnsi="Symbol" w:hint="default"/>
+      </w:rPr>
+    </w:lvl>
+    <w:lvl w:ilvl="7" w:tplc="080A0003" w:tentative="1">
+      <w:start w:val="1"/>
+      <w:numFmt w:val="bullet"/>
+      <w:lvlText w:val="o"/>
+      <w:lvlJc w:val="left"/>
+      <w:pPr>
+        <w:ind w:left="5760" w:hanging="360"/>
+      </w:pPr>
+      <w:rPr>
+        <w:rFonts w:ascii="Courier New" w:hAnsi="Courier New" w:cs="Courier New" w:hint="default"/>
+      </w:rPr>
+    </w:lvl>
+    <w:lvl w:ilvl="8" w:tplc="080A0005" w:tentative="1">
+      <w:start w:val="1"/>
+      <w:numFmt w:val="bullet"/>
+      <w:lvlText w:val=""/>
+      <w:lvlJc w:val="left"/>
+      <w:pPr>
+        <w:ind w:left="6480" w:hanging="360"/>
+      </w:pPr>
+      <w:rPr>
+        <w:rFonts w:ascii="Wingdings" w:hAnsi="Wingdings" w:hint="default"/>
+      </w:rPr>
+    </w:lvl>
+  </w:abstractNum>
+  <w:abstractNum w:abstractNumId="16" w15:restartNumberingAfterBreak="0">
     <w:nsid w:val="3D2C0E66"/>
     <w:multiLevelType w:val="hybridMultilevel"/>
     <w:tmpl w:val="324A86FE"/>
@@ -4026,7 +5718,7 @@
       </w:rPr>
     </w:lvl>
   </w:abstractNum>
-  <w:abstractNum w:abstractNumId="16" w15:restartNumberingAfterBreak="0">
+  <w:abstractNum w:abstractNumId="17" w15:restartNumberingAfterBreak="0">
     <w:nsid w:val="3D4950BC"/>
     <w:multiLevelType w:val="hybridMultilevel"/>
     <w:tmpl w:val="32C636D8"/>
@@ -4139,7 +5831,7 @@
       </w:rPr>
     </w:lvl>
   </w:abstractNum>
-  <w:abstractNum w:abstractNumId="17" w15:restartNumberingAfterBreak="0">
+  <w:abstractNum w:abstractNumId="18" w15:restartNumberingAfterBreak="0">
     <w:nsid w:val="3EE357D5"/>
     <w:multiLevelType w:val="hybridMultilevel"/>
     <w:tmpl w:val="B06250B4"/>
@@ -4252,7 +5944,7 @@
       </w:rPr>
     </w:lvl>
   </w:abstractNum>
-  <w:abstractNum w:abstractNumId="18" w15:restartNumberingAfterBreak="0">
+  <w:abstractNum w:abstractNumId="19" w15:restartNumberingAfterBreak="0">
     <w:nsid w:val="432058A2"/>
     <w:multiLevelType w:val="hybridMultilevel"/>
     <w:tmpl w:val="EC5621DC"/>
@@ -4365,7 +6057,7 @@
       </w:rPr>
     </w:lvl>
   </w:abstractNum>
-  <w:abstractNum w:abstractNumId="19" w15:restartNumberingAfterBreak="0">
+  <w:abstractNum w:abstractNumId="20" w15:restartNumberingAfterBreak="0">
     <w:nsid w:val="45C55BFE"/>
     <w:multiLevelType w:val="hybridMultilevel"/>
     <w:tmpl w:val="D92E599C"/>
@@ -4478,7 +6170,7 @@
       </w:rPr>
     </w:lvl>
   </w:abstractNum>
-  <w:abstractNum w:abstractNumId="20" w15:restartNumberingAfterBreak="0">
+  <w:abstractNum w:abstractNumId="21" w15:restartNumberingAfterBreak="0">
     <w:nsid w:val="4789116B"/>
     <w:multiLevelType w:val="hybridMultilevel"/>
     <w:tmpl w:val="F5D0E744"/>
@@ -4591,7 +6283,120 @@
       </w:rPr>
     </w:lvl>
   </w:abstractNum>
-  <w:abstractNum w:abstractNumId="21" w15:restartNumberingAfterBreak="0">
+  <w:abstractNum w:abstractNumId="22" w15:restartNumberingAfterBreak="0">
+    <w:nsid w:val="4B0C48E6"/>
+    <w:multiLevelType w:val="hybridMultilevel"/>
+    <w:tmpl w:val="E9166F78"/>
+    <w:lvl w:ilvl="0" w:tplc="080A0001">
+      <w:start w:val="1"/>
+      <w:numFmt w:val="bullet"/>
+      <w:lvlText w:val=""/>
+      <w:lvlJc w:val="left"/>
+      <w:pPr>
+        <w:ind w:left="720" w:hanging="360"/>
+      </w:pPr>
+      <w:rPr>
+        <w:rFonts w:ascii="Symbol" w:hAnsi="Symbol" w:hint="default"/>
+      </w:rPr>
+    </w:lvl>
+    <w:lvl w:ilvl="1" w:tplc="080A0003" w:tentative="1">
+      <w:start w:val="1"/>
+      <w:numFmt w:val="bullet"/>
+      <w:lvlText w:val="o"/>
+      <w:lvlJc w:val="left"/>
+      <w:pPr>
+        <w:ind w:left="1440" w:hanging="360"/>
+      </w:pPr>
+      <w:rPr>
+        <w:rFonts w:ascii="Courier New" w:hAnsi="Courier New" w:cs="Courier New" w:hint="default"/>
+      </w:rPr>
+    </w:lvl>
+    <w:lvl w:ilvl="2" w:tplc="080A0005" w:tentative="1">
+      <w:start w:val="1"/>
+      <w:numFmt w:val="bullet"/>
+      <w:lvlText w:val=""/>
+      <w:lvlJc w:val="left"/>
+      <w:pPr>
+        <w:ind w:left="2160" w:hanging="360"/>
+      </w:pPr>
+      <w:rPr>
+        <w:rFonts w:ascii="Wingdings" w:hAnsi="Wingdings" w:hint="default"/>
+      </w:rPr>
+    </w:lvl>
+    <w:lvl w:ilvl="3" w:tplc="080A0001" w:tentative="1">
+      <w:start w:val="1"/>
+      <w:numFmt w:val="bullet"/>
+      <w:lvlText w:val=""/>
+      <w:lvlJc w:val="left"/>
+      <w:pPr>
+        <w:ind w:left="2880" w:hanging="360"/>
+      </w:pPr>
+      <w:rPr>
+        <w:rFonts w:ascii="Symbol" w:hAnsi="Symbol" w:hint="default"/>
+      </w:rPr>
+    </w:lvl>
+    <w:lvl w:ilvl="4" w:tplc="080A0003" w:tentative="1">
+      <w:start w:val="1"/>
+      <w:numFmt w:val="bullet"/>
+      <w:lvlText w:val="o"/>
+      <w:lvlJc w:val="left"/>
+      <w:pPr>
+        <w:ind w:left="3600" w:hanging="360"/>
+      </w:pPr>
+      <w:rPr>
+        <w:rFonts w:ascii="Courier New" w:hAnsi="Courier New" w:cs="Courier New" w:hint="default"/>
+      </w:rPr>
+    </w:lvl>
+    <w:lvl w:ilvl="5" w:tplc="080A0005" w:tentative="1">
+      <w:start w:val="1"/>
+      <w:numFmt w:val="bullet"/>
+      <w:lvlText w:val=""/>
+      <w:lvlJc w:val="left"/>
+      <w:pPr>
+        <w:ind w:left="4320" w:hanging="360"/>
+      </w:pPr>
+      <w:rPr>
+        <w:rFonts w:ascii="Wingdings" w:hAnsi="Wingdings" w:hint="default"/>
+      </w:rPr>
+    </w:lvl>
+    <w:lvl w:ilvl="6" w:tplc="080A0001" w:tentative="1">
+      <w:start w:val="1"/>
+      <w:numFmt w:val="bullet"/>
+      <w:lvlText w:val=""/>
+      <w:lvlJc w:val="left"/>
+      <w:pPr>
+        <w:ind w:left="5040" w:hanging="360"/>
+      </w:pPr>
+      <w:rPr>
+        <w:rFonts w:ascii="Symbol" w:hAnsi="Symbol" w:hint="default"/>
+      </w:rPr>
+    </w:lvl>
+    <w:lvl w:ilvl="7" w:tplc="080A0003" w:tentative="1">
+      <w:start w:val="1"/>
+      <w:numFmt w:val="bullet"/>
+      <w:lvlText w:val="o"/>
+      <w:lvlJc w:val="left"/>
+      <w:pPr>
+        <w:ind w:left="5760" w:hanging="360"/>
+      </w:pPr>
+      <w:rPr>
+        <w:rFonts w:ascii="Courier New" w:hAnsi="Courier New" w:cs="Courier New" w:hint="default"/>
+      </w:rPr>
+    </w:lvl>
+    <w:lvl w:ilvl="8" w:tplc="080A0005" w:tentative="1">
+      <w:start w:val="1"/>
+      <w:numFmt w:val="bullet"/>
+      <w:lvlText w:val=""/>
+      <w:lvlJc w:val="left"/>
+      <w:pPr>
+        <w:ind w:left="6480" w:hanging="360"/>
+      </w:pPr>
+      <w:rPr>
+        <w:rFonts w:ascii="Wingdings" w:hAnsi="Wingdings" w:hint="default"/>
+      </w:rPr>
+    </w:lvl>
+  </w:abstractNum>
+  <w:abstractNum w:abstractNumId="23" w15:restartNumberingAfterBreak="0">
     <w:nsid w:val="4FA653D3"/>
     <w:multiLevelType w:val="hybridMultilevel"/>
     <w:tmpl w:val="2F145B30"/>
@@ -4680,7 +6485,7 @@
       </w:pPr>
     </w:lvl>
   </w:abstractNum>
-  <w:abstractNum w:abstractNumId="22" w15:restartNumberingAfterBreak="0">
+  <w:abstractNum w:abstractNumId="24" w15:restartNumberingAfterBreak="0">
     <w:nsid w:val="5C614E09"/>
     <w:multiLevelType w:val="hybridMultilevel"/>
     <w:tmpl w:val="C6F0588A"/>
@@ -4766,7 +6571,7 @@
       </w:pPr>
     </w:lvl>
   </w:abstractNum>
-  <w:abstractNum w:abstractNumId="23" w15:restartNumberingAfterBreak="0">
+  <w:abstractNum w:abstractNumId="25" w15:restartNumberingAfterBreak="0">
     <w:nsid w:val="5D0303E9"/>
     <w:multiLevelType w:val="hybridMultilevel"/>
     <w:tmpl w:val="7BF8642E"/>
@@ -4852,7 +6657,7 @@
       </w:pPr>
     </w:lvl>
   </w:abstractNum>
-  <w:abstractNum w:abstractNumId="24" w15:restartNumberingAfterBreak="0">
+  <w:abstractNum w:abstractNumId="26" w15:restartNumberingAfterBreak="0">
     <w:nsid w:val="5D3E675A"/>
     <w:multiLevelType w:val="hybridMultilevel"/>
     <w:tmpl w:val="531CDDE4"/>
@@ -4965,7 +6770,7 @@
       </w:rPr>
     </w:lvl>
   </w:abstractNum>
-  <w:abstractNum w:abstractNumId="25" w15:restartNumberingAfterBreak="0">
+  <w:abstractNum w:abstractNumId="27" w15:restartNumberingAfterBreak="0">
     <w:nsid w:val="5E2162D0"/>
     <w:multiLevelType w:val="hybridMultilevel"/>
     <w:tmpl w:val="19F640F0"/>
@@ -5078,7 +6883,7 @@
       </w:rPr>
     </w:lvl>
   </w:abstractNum>
-  <w:abstractNum w:abstractNumId="26" w15:restartNumberingAfterBreak="0">
+  <w:abstractNum w:abstractNumId="28" w15:restartNumberingAfterBreak="0">
     <w:nsid w:val="63520ADD"/>
     <w:multiLevelType w:val="hybridMultilevel"/>
     <w:tmpl w:val="D97630C4"/>
@@ -5191,7 +6996,7 @@
       </w:rPr>
     </w:lvl>
   </w:abstractNum>
-  <w:abstractNum w:abstractNumId="27" w15:restartNumberingAfterBreak="0">
+  <w:abstractNum w:abstractNumId="29" w15:restartNumberingAfterBreak="0">
     <w:nsid w:val="67A32EBF"/>
     <w:multiLevelType w:val="hybridMultilevel"/>
     <w:tmpl w:val="127C7076"/>
@@ -5304,7 +7109,7 @@
       </w:rPr>
     </w:lvl>
   </w:abstractNum>
-  <w:abstractNum w:abstractNumId="28" w15:restartNumberingAfterBreak="0">
+  <w:abstractNum w:abstractNumId="30" w15:restartNumberingAfterBreak="0">
     <w:nsid w:val="6E6F759E"/>
     <w:multiLevelType w:val="hybridMultilevel"/>
     <w:tmpl w:val="1CA448FC"/>
@@ -5417,7 +7222,7 @@
       </w:rPr>
     </w:lvl>
   </w:abstractNum>
-  <w:abstractNum w:abstractNumId="29" w15:restartNumberingAfterBreak="0">
+  <w:abstractNum w:abstractNumId="31" w15:restartNumberingAfterBreak="0">
     <w:nsid w:val="784530C1"/>
     <w:multiLevelType w:val="hybridMultilevel"/>
     <w:tmpl w:val="3CF6FE18"/>
@@ -5530,7 +7335,7 @@
       </w:rPr>
     </w:lvl>
   </w:abstractNum>
-  <w:abstractNum w:abstractNumId="30" w15:restartNumberingAfterBreak="0">
+  <w:abstractNum w:abstractNumId="32" w15:restartNumberingAfterBreak="0">
     <w:nsid w:val="7C226B17"/>
     <w:multiLevelType w:val="hybridMultilevel"/>
     <w:tmpl w:val="316EBF58"/>
@@ -5643,7 +7448,7 @@
       </w:rPr>
     </w:lvl>
   </w:abstractNum>
-  <w:abstractNum w:abstractNumId="31" w15:restartNumberingAfterBreak="0">
+  <w:abstractNum w:abstractNumId="33" w15:restartNumberingAfterBreak="0">
     <w:nsid w:val="7C7324D3"/>
     <w:multiLevelType w:val="hybridMultilevel"/>
     <w:tmpl w:val="FBB601F2"/>
@@ -5754,6 +7559,92 @@
       <w:rPr>
         <w:rFonts w:ascii="Wingdings" w:hAnsi="Wingdings" w:hint="default"/>
       </w:rPr>
+    </w:lvl>
+  </w:abstractNum>
+  <w:abstractNum w:abstractNumId="34" w15:restartNumberingAfterBreak="0">
+    <w:nsid w:val="7DC65CF4"/>
+    <w:multiLevelType w:val="hybridMultilevel"/>
+    <w:tmpl w:val="6E36658C"/>
+    <w:lvl w:ilvl="0" w:tplc="080A000F">
+      <w:start w:val="1"/>
+      <w:numFmt w:val="decimal"/>
+      <w:lvlText w:val="%1."/>
+      <w:lvlJc w:val="left"/>
+      <w:pPr>
+        <w:ind w:left="720" w:hanging="360"/>
+      </w:pPr>
+    </w:lvl>
+    <w:lvl w:ilvl="1" w:tplc="080A0019">
+      <w:start w:val="1"/>
+      <w:numFmt w:val="lowerLetter"/>
+      <w:lvlText w:val="%2."/>
+      <w:lvlJc w:val="left"/>
+      <w:pPr>
+        <w:ind w:left="1440" w:hanging="360"/>
+      </w:pPr>
+    </w:lvl>
+    <w:lvl w:ilvl="2" w:tplc="080A001B">
+      <w:start w:val="1"/>
+      <w:numFmt w:val="lowerRoman"/>
+      <w:lvlText w:val="%3."/>
+      <w:lvlJc w:val="right"/>
+      <w:pPr>
+        <w:ind w:left="2160" w:hanging="180"/>
+      </w:pPr>
+    </w:lvl>
+    <w:lvl w:ilvl="3" w:tplc="080A000F" w:tentative="1">
+      <w:start w:val="1"/>
+      <w:numFmt w:val="decimal"/>
+      <w:lvlText w:val="%4."/>
+      <w:lvlJc w:val="left"/>
+      <w:pPr>
+        <w:ind w:left="2880" w:hanging="360"/>
+      </w:pPr>
+    </w:lvl>
+    <w:lvl w:ilvl="4" w:tplc="080A0019" w:tentative="1">
+      <w:start w:val="1"/>
+      <w:numFmt w:val="lowerLetter"/>
+      <w:lvlText w:val="%5."/>
+      <w:lvlJc w:val="left"/>
+      <w:pPr>
+        <w:ind w:left="3600" w:hanging="360"/>
+      </w:pPr>
+    </w:lvl>
+    <w:lvl w:ilvl="5" w:tplc="080A001B" w:tentative="1">
+      <w:start w:val="1"/>
+      <w:numFmt w:val="lowerRoman"/>
+      <w:lvlText w:val="%6."/>
+      <w:lvlJc w:val="right"/>
+      <w:pPr>
+        <w:ind w:left="4320" w:hanging="180"/>
+      </w:pPr>
+    </w:lvl>
+    <w:lvl w:ilvl="6" w:tplc="080A000F" w:tentative="1">
+      <w:start w:val="1"/>
+      <w:numFmt w:val="decimal"/>
+      <w:lvlText w:val="%7."/>
+      <w:lvlJc w:val="left"/>
+      <w:pPr>
+        <w:ind w:left="5040" w:hanging="360"/>
+      </w:pPr>
+    </w:lvl>
+    <w:lvl w:ilvl="7" w:tplc="080A0019" w:tentative="1">
+      <w:start w:val="1"/>
+      <w:numFmt w:val="lowerLetter"/>
+      <w:lvlText w:val="%8."/>
+      <w:lvlJc w:val="left"/>
+      <w:pPr>
+        <w:ind w:left="5760" w:hanging="360"/>
+      </w:pPr>
+    </w:lvl>
+    <w:lvl w:ilvl="8" w:tplc="080A001B" w:tentative="1">
+      <w:start w:val="1"/>
+      <w:numFmt w:val="lowerRoman"/>
+      <w:lvlText w:val="%9."/>
+      <w:lvlJc w:val="right"/>
+      <w:pPr>
+        <w:ind w:left="6480" w:hanging="180"/>
+      </w:pPr>
     </w:lvl>
   </w:abstractNum>
   <w:num w:numId="1" w16cid:durableId="1507473298">
@@ -5763,34 +7654,34 @@
     <w:abstractNumId w:val="4"/>
   </w:num>
   <w:num w:numId="3" w16cid:durableId="1516307261">
-    <w:abstractNumId w:val="27"/>
+    <w:abstractNumId w:val="29"/>
   </w:num>
   <w:num w:numId="4" w16cid:durableId="263998001">
-    <w:abstractNumId w:val="29"/>
+    <w:abstractNumId w:val="31"/>
   </w:num>
   <w:num w:numId="5" w16cid:durableId="1694530711">
     <w:abstractNumId w:val="3"/>
   </w:num>
   <w:num w:numId="6" w16cid:durableId="399212304">
-    <w:abstractNumId w:val="26"/>
+    <w:abstractNumId w:val="28"/>
   </w:num>
   <w:num w:numId="7" w16cid:durableId="1510755812">
-    <w:abstractNumId w:val="31"/>
+    <w:abstractNumId w:val="33"/>
   </w:num>
   <w:num w:numId="8" w16cid:durableId="401295270">
-    <w:abstractNumId w:val="28"/>
+    <w:abstractNumId w:val="30"/>
   </w:num>
   <w:num w:numId="9" w16cid:durableId="1237131580">
-    <w:abstractNumId w:val="16"/>
+    <w:abstractNumId w:val="17"/>
   </w:num>
   <w:num w:numId="10" w16cid:durableId="1815832771">
-    <w:abstractNumId w:val="19"/>
+    <w:abstractNumId w:val="20"/>
   </w:num>
   <w:num w:numId="11" w16cid:durableId="1210530553">
     <w:abstractNumId w:val="10"/>
   </w:num>
   <w:num w:numId="12" w16cid:durableId="709888915">
-    <w:abstractNumId w:val="15"/>
+    <w:abstractNumId w:val="16"/>
   </w:num>
   <w:num w:numId="13" w16cid:durableId="1638875566">
     <w:abstractNumId w:val="0"/>
@@ -5802,28 +7693,28 @@
     <w:abstractNumId w:val="9"/>
   </w:num>
   <w:num w:numId="16" w16cid:durableId="2101368299">
-    <w:abstractNumId w:val="25"/>
+    <w:abstractNumId w:val="27"/>
   </w:num>
   <w:num w:numId="17" w16cid:durableId="1383942363">
     <w:abstractNumId w:val="14"/>
   </w:num>
   <w:num w:numId="18" w16cid:durableId="975914109">
-    <w:abstractNumId w:val="18"/>
+    <w:abstractNumId w:val="19"/>
   </w:num>
   <w:num w:numId="19" w16cid:durableId="707417816">
-    <w:abstractNumId w:val="22"/>
+    <w:abstractNumId w:val="24"/>
   </w:num>
   <w:num w:numId="20" w16cid:durableId="1331831440">
     <w:abstractNumId w:val="7"/>
   </w:num>
   <w:num w:numId="21" w16cid:durableId="1910534101">
-    <w:abstractNumId w:val="30"/>
+    <w:abstractNumId w:val="32"/>
   </w:num>
   <w:num w:numId="22" w16cid:durableId="124473379">
     <w:abstractNumId w:val="8"/>
   </w:num>
   <w:num w:numId="23" w16cid:durableId="256406080">
-    <w:abstractNumId w:val="24"/>
+    <w:abstractNumId w:val="26"/>
   </w:num>
   <w:num w:numId="24" w16cid:durableId="1952279886">
     <w:abstractNumId w:val="1"/>
@@ -5832,25 +7723,34 @@
     <w:abstractNumId w:val="6"/>
   </w:num>
   <w:num w:numId="26" w16cid:durableId="200168938">
-    <w:abstractNumId w:val="17"/>
+    <w:abstractNumId w:val="18"/>
   </w:num>
   <w:num w:numId="27" w16cid:durableId="240065754">
     <w:abstractNumId w:val="13"/>
   </w:num>
   <w:num w:numId="28" w16cid:durableId="1593396341">
-    <w:abstractNumId w:val="23"/>
+    <w:abstractNumId w:val="25"/>
   </w:num>
   <w:num w:numId="29" w16cid:durableId="36511375">
-    <w:abstractNumId w:val="21"/>
+    <w:abstractNumId w:val="23"/>
   </w:num>
   <w:num w:numId="30" w16cid:durableId="853804131">
     <w:abstractNumId w:val="2"/>
   </w:num>
   <w:num w:numId="31" w16cid:durableId="1256211548">
-    <w:abstractNumId w:val="20"/>
+    <w:abstractNumId w:val="21"/>
   </w:num>
   <w:num w:numId="32" w16cid:durableId="1482887219">
     <w:abstractNumId w:val="12"/>
+  </w:num>
+  <w:num w:numId="33" w16cid:durableId="1628971718">
+    <w:abstractNumId w:val="15"/>
+  </w:num>
+  <w:num w:numId="34" w16cid:durableId="2135825846">
+    <w:abstractNumId w:val="34"/>
+  </w:num>
+  <w:num w:numId="35" w16cid:durableId="451751246">
+    <w:abstractNumId w:val="22"/>
   </w:num>
   <w:numIdMacAtCleanup w:val="13"/>
 </w:numbering>
@@ -6334,6 +8234,7 @@
   <w:style w:type="character" w:default="1" w:styleId="Fuentedeprrafopredeter">
     <w:name w:val="Default Paragraph Font"/>
     <w:uiPriority w:val="1"/>
+    <w:semiHidden/>
     <w:unhideWhenUsed/>
   </w:style>
   <w:style w:type="table" w:default="1" w:styleId="Tablanormal">
@@ -7387,6 +9288,19 @@
       <w:i/>
       <w:iCs/>
     </w:rPr>
+  </w:style>
+  <w:style w:type="paragraph" w:styleId="TDC3">
+    <w:name w:val="toc 3"/>
+    <w:basedOn w:val="Normal"/>
+    <w:next w:val="Normal"/>
+    <w:autoRedefine/>
+    <w:uiPriority w:val="39"/>
+    <w:unhideWhenUsed/>
+    <w:rsid w:val="00EF494B"/>
+    <w:pPr>
+      <w:spacing w:after="100"/>
+      <w:ind w:left="480"/>
+    </w:pPr>
   </w:style>
 </w:styles>
 </file>

</xml_diff>